<commit_message>
lab1_1 and lab1_2 final
</commit_message>
<xml_diff>
--- a/Sem1/fedko_artem_6391_lab1_1.docx
+++ b/Sem1/fedko_artem_6391_lab1_1.docx
@@ -521,19 +521,73 @@
         <w:t xml:space="preserve"> </w:t>
       </w:r>
       <w:r>
+        <w:t>A,</w:t>
+      </w:r>
+      <w:r>
+        <w:t xml:space="preserve"> </w:t>
+      </w:r>
+      <w:r>
+        <w:t>B,</w:t>
+      </w:r>
+      <w:r>
+        <w:t xml:space="preserve"> </w:t>
+      </w:r>
+      <w:r>
+        <w:t>C</w:t>
+      </w:r>
+      <w:r>
+        <w:t xml:space="preserve"> </w:t>
+      </w:r>
+      <w:r>
+        <w:t>и проверяемую точку</w:t>
+      </w:r>
+      <w:r>
+        <w:t xml:space="preserve"> </w:t>
+      </w:r>
+      <w:r>
+        <w:t>M.</w:t>
+      </w:r>
+      <w:r>
+        <w:t xml:space="preserve"> </w:t>
+      </w:r>
+      <w:r>
+        <w:t>Сторона</w:t>
+      </w:r>
+      <w:r>
+        <w:t xml:space="preserve"> </w:t>
+      </w:r>
+      <w:r>
+        <w:t>AB.</w:t>
+      </w:r>
+      <w:r>
+        <w:t xml:space="preserve"> </w:t>
+      </w:r>
+      <w:r>
+        <w:t>Строится уравнение прямой, проходящей через вершины</w:t>
+      </w:r>
+      <w:r>
+        <w:t xml:space="preserve"> </w:t>
+      </w:r>
+      <w:r>
         <w:t>A</w:t>
       </w:r>
       <w:r>
-        <w:t>,</w:t>
-      </w:r>
-      <w:r>
-        <w:t xml:space="preserve"> </w:t>
-      </w:r>
-      <w:r>
-        <w:t>B</w:t>
-      </w:r>
-      <w:r>
-        <w:t>,</w:t>
+        <w:t xml:space="preserve"> </w:t>
+      </w:r>
+      <w:r>
+        <w:t>и</w:t>
+      </w:r>
+      <w:r>
+        <w:t xml:space="preserve"> </w:t>
+      </w:r>
+      <w:r>
+        <w:t>B. Вычисляется положение</w:t>
+      </w:r>
+      <w:r>
+        <w:t xml:space="preserve"> </w:t>
+      </w:r>
+      <w:r>
+        <w:t>противоположной вершины</w:t>
       </w:r>
       <w:r>
         <w:t xml:space="preserve"> </w:t>
@@ -545,7 +599,7 @@
         <w:t xml:space="preserve"> </w:t>
       </w:r>
       <w:r>
-        <w:t>и проверяемую точку</w:t>
+        <w:t>и проверяемой точки</w:t>
       </w:r>
       <w:r>
         <w:t xml:space="preserve"> </w:t>
@@ -554,7 +608,52 @@
         <w:t>M</w:t>
       </w:r>
       <w:r>
-        <w:t>.</w:t>
+        <w:t xml:space="preserve"> </w:t>
+      </w:r>
+      <w:r>
+        <w:t>относительно этой прямой. Если</w:t>
+      </w:r>
+      <w:r>
+        <w:t xml:space="preserve"> </w:t>
+      </w:r>
+      <w:r>
+        <w:t>C</w:t>
+      </w:r>
+      <w:r>
+        <w:t xml:space="preserve"> </w:t>
+      </w:r>
+      <w:r>
+        <w:t>и</w:t>
+      </w:r>
+      <w:r>
+        <w:t xml:space="preserve"> </w:t>
+      </w:r>
+      <w:r>
+        <w:t>M</w:t>
+      </w:r>
+      <w:r>
+        <w:t xml:space="preserve"> </w:t>
+      </w:r>
+      <w:r>
+        <w:t>оказываются по одну</w:t>
+      </w:r>
+      <w:r>
+        <w:t xml:space="preserve"> </w:t>
+      </w:r>
+      <w:r>
+        <w:t>сторону (или</w:t>
+      </w:r>
+      <w:r>
+        <w:t xml:space="preserve"> </w:t>
+      </w:r>
+      <w:r>
+        <w:t>M</w:t>
+      </w:r>
+      <w:r>
+        <w:t xml:space="preserve"> </w:t>
+      </w:r>
+      <w:r>
+        <w:t>лежит на прямой), проверка пройдена.</w:t>
       </w:r>
       <w:r>
         <w:t xml:space="preserve"> </w:t>
@@ -566,106 +665,25 @@
         <w:t xml:space="preserve"> </w:t>
       </w:r>
       <w:r>
-        <w:t>AB.</w:t>
-      </w:r>
-      <w:r>
-        <w:t xml:space="preserve"> </w:t>
-      </w:r>
-      <w:r>
-        <w:t>Строится уравнение прямой, проходящей через вершины</w:t>
-      </w:r>
-      <w:r>
-        <w:t xml:space="preserve"> </w:t>
-      </w:r>
-      <w:r>
-        <w:t>A</w:t>
-      </w:r>
-      <w:r>
-        <w:t xml:space="preserve"> </w:t>
-      </w:r>
-      <w:r>
-        <w:t>и</w:t>
-      </w:r>
-      <w:r>
-        <w:t xml:space="preserve"> </w:t>
-      </w:r>
-      <w:r>
-        <w:t>B</w:t>
-      </w:r>
-      <w:r>
-        <w:t>. Вычисляется положение</w:t>
-      </w:r>
-      <w:r>
-        <w:t xml:space="preserve"> </w:t>
-      </w:r>
-      <w:r>
-        <w:t>противоположной вершины</w:t>
-      </w:r>
-      <w:r>
-        <w:t xml:space="preserve"> </w:t>
-      </w:r>
-      <w:r>
-        <w:t>C</w:t>
-      </w:r>
-      <w:r>
-        <w:t xml:space="preserve"> </w:t>
-      </w:r>
-      <w:r>
-        <w:t>и проверяемой точки</w:t>
-      </w:r>
-      <w:r>
-        <w:t xml:space="preserve"> </w:t>
-      </w:r>
-      <w:r>
-        <w:t>M</w:t>
-      </w:r>
-      <w:r>
-        <w:t xml:space="preserve"> </w:t>
-      </w:r>
-      <w:r>
-        <w:t>относительно этой прямой. Если</w:t>
-      </w:r>
-      <w:r>
-        <w:t xml:space="preserve"> </w:t>
-      </w:r>
-      <w:r>
-        <w:t>C</w:t>
-      </w:r>
-      <w:r>
-        <w:t xml:space="preserve"> </w:t>
-      </w:r>
-      <w:r>
-        <w:t>и</w:t>
-      </w:r>
-      <w:r>
-        <w:t xml:space="preserve"> </w:t>
-      </w:r>
-      <w:r>
-        <w:t>M</w:t>
-      </w:r>
-      <w:r>
-        <w:t xml:space="preserve"> </w:t>
-      </w:r>
-      <w:r>
-        <w:t>оказываются по одну</w:t>
-      </w:r>
-      <w:r>
-        <w:t xml:space="preserve"> </w:t>
-      </w:r>
-      <w:r>
-        <w:t>сторону (или</w:t>
-      </w:r>
-      <w:r>
-        <w:t xml:space="preserve"> </w:t>
-      </w:r>
-      <w:r>
-        <w:t>M</w:t>
-      </w:r>
-      <w:r>
-        <w:t xml:space="preserve"> </w:t>
-      </w:r>
-      <w:r>
-        <w:t>лежит на прямой), проверка пройдена.</w:t>
+        <w:t>BC.</w:t>
+      </w:r>
+      <w:r>
+        <w:t xml:space="preserve"> </w:t>
+      </w:r>
+      <w:r>
+        <w:t>Аналогично: противоположная вершина —</w:t>
+      </w:r>
+      <w:r>
+        <w:t xml:space="preserve"> </w:t>
+      </w:r>
+      <w:r>
+        <w:t>A, проверяемая точка —</w:t>
+      </w:r>
+      <w:r>
+        <w:t xml:space="preserve"> </w:t>
+      </w:r>
+      <w:r>
+        <w:t>M.</w:t>
       </w:r>
       <w:r>
         <w:t xml:space="preserve"> </w:t>
@@ -677,42 +695,6 @@
         <w:t xml:space="preserve"> </w:t>
       </w:r>
       <w:r>
-        <w:t>BC.</w:t>
-      </w:r>
-      <w:r>
-        <w:t xml:space="preserve"> </w:t>
-      </w:r>
-      <w:r>
-        <w:t>Аналогично: противоположная вершина —</w:t>
-      </w:r>
-      <w:r>
-        <w:t xml:space="preserve"> </w:t>
-      </w:r>
-      <w:r>
-        <w:t>A</w:t>
-      </w:r>
-      <w:r>
-        <w:t>, проверяемая точка —</w:t>
-      </w:r>
-      <w:r>
-        <w:t xml:space="preserve"> </w:t>
-      </w:r>
-      <w:r>
-        <w:t>M</w:t>
-      </w:r>
-      <w:r>
-        <w:t>.</w:t>
-      </w:r>
-      <w:r>
-        <w:t xml:space="preserve"> </w:t>
-      </w:r>
-      <w:r>
-        <w:t>Сторона</w:t>
-      </w:r>
-      <w:r>
-        <w:t xml:space="preserve"> </w:t>
-      </w:r>
-      <w:r>
         <w:t>CA.</w:t>
       </w:r>
       <w:r>
@@ -725,19 +707,13 @@
         <w:t xml:space="preserve"> </w:t>
       </w:r>
       <w:r>
-        <w:t>B</w:t>
-      </w:r>
-      <w:r>
-        <w:t>, проверяемая точка —</w:t>
-      </w:r>
-      <w:r>
-        <w:t xml:space="preserve"> </w:t>
-      </w:r>
-      <w:r>
-        <w:t>M</w:t>
-      </w:r>
-      <w:r>
-        <w:t>.</w:t>
+        <w:t>B, проверяемая точка —</w:t>
+      </w:r>
+      <w:r>
+        <w:t xml:space="preserve"> </w:t>
+      </w:r>
+      <w:r>
+        <w:t>M.</w:t>
       </w:r>
       <w:r>
         <w:t xml:space="preserve"> </w:t>
@@ -765,96 +741,204 @@
       </w:r>
       <w:proofErr w:type="gramEnd"/>
       <w:r>
-        <w:t>a, b, c, m)</w:t>
-      </w:r>
-      <w:r>
-        <w:t>, противоположная вершина — третьим аргументом</w:t>
-      </w:r>
-      <w:r>
-        <w:t xml:space="preserve"> </w:t>
-      </w:r>
-      <w:r>
+        <w:t>a, b, c, m), противоположная вершина — третьим аргументом</w:t>
+      </w:r>
+      <w:r>
+        <w:t xml:space="preserve"> </w:t>
+      </w:r>
+      <w:r>
+        <w:t>c, проверяемая точка — четвёртым аргументом</w:t>
+      </w:r>
+      <w:r>
+        <w:t xml:space="preserve"> </w:t>
+      </w:r>
+      <w:r>
+        <w:t>m.</w:t>
+      </w:r>
+      <w:r>
+        <w:t xml:space="preserve"> </w:t>
+      </w:r>
+      <w:r>
+        <w:t>Для каждой стороны выполняется сравнение знаков величин</w:t>
+      </w:r>
+      <w:r>
+        <w:t xml:space="preserve"> </w:t>
+      </w:r>
+      <w:proofErr w:type="spellStart"/>
+      <w:r>
+        <w:t>deltaC</w:t>
+      </w:r>
+      <w:proofErr w:type="spellEnd"/>
+      <w:r>
+        <w:t xml:space="preserve"> = </w:t>
+      </w:r>
+      <w:proofErr w:type="spellStart"/>
+      <w:r>
+        <w:t>c.y</w:t>
+      </w:r>
+      <w:proofErr w:type="spellEnd"/>
+      <w:r>
+        <w:t xml:space="preserve"> </w:t>
+      </w:r>
+      <w:r>
+        <w:t>–</w:t>
+      </w:r>
+      <w:r>
+        <w:t xml:space="preserve"> </w:t>
+      </w:r>
+      <w:r>
+        <w:t>(</w:t>
+      </w:r>
+      <w:r>
+        <w:rPr>
+          <w:lang w:val="en-US"/>
+        </w:rPr>
         <w:t>c</w:t>
       </w:r>
       <w:r>
-        <w:t>, проверяемая точка — четвёртым аргументом</w:t>
-      </w:r>
-      <w:r>
-        <w:t xml:space="preserve"> </w:t>
-      </w:r>
-      <w:r>
+        <w:t>.</w:t>
+      </w:r>
+      <w:r>
+        <w:rPr>
+          <w:lang w:val="en-US"/>
+        </w:rPr>
+        <w:t>x</w:t>
+      </w:r>
+      <w:r>
+        <w:t>*</w:t>
+      </w:r>
+      <w:r>
+        <w:rPr>
+          <w:lang w:val="en-US"/>
+        </w:rPr>
+        <w:t>K</w:t>
+      </w:r>
+      <w:r>
+        <w:t>+</w:t>
+      </w:r>
+      <w:r>
+        <w:rPr>
+          <w:lang w:val="en-US"/>
+        </w:rPr>
+        <w:t>B</w:t>
+      </w:r>
+      <w:r>
+        <w:t>)</w:t>
+      </w:r>
+      <w:r>
+        <w:t xml:space="preserve"> </w:t>
+      </w:r>
+      <w:r>
+        <w:t>и</w:t>
+      </w:r>
+      <w:r>
+        <w:t xml:space="preserve"> </w:t>
+      </w:r>
+      <w:proofErr w:type="spellStart"/>
+      <w:r>
+        <w:t>deltaM</w:t>
+      </w:r>
+      <w:proofErr w:type="spellEnd"/>
+      <w:r>
+        <w:t xml:space="preserve"> = </w:t>
+      </w:r>
+      <w:proofErr w:type="spellStart"/>
+      <w:r>
+        <w:t>m.y</w:t>
+      </w:r>
+      <w:proofErr w:type="spellEnd"/>
+      <w:r>
+        <w:t xml:space="preserve"> </w:t>
+      </w:r>
+      <w:r>
+        <w:t>–</w:t>
+      </w:r>
+      <w:r>
+        <w:t xml:space="preserve"> (</w:t>
+      </w:r>
+      <w:r>
+        <w:rPr>
+          <w:lang w:val="en-US"/>
+        </w:rPr>
         <w:t>m</w:t>
       </w:r>
       <w:r>
         <w:t>.</w:t>
       </w:r>
       <w:r>
-        <w:t xml:space="preserve"> </w:t>
-      </w:r>
-      <w:r>
-        <w:t>Для каждой стороны выполняется сравнение знаков величин</w:t>
+        <w:rPr>
+          <w:lang w:val="en-US"/>
+        </w:rPr>
+        <w:t>x</w:t>
+      </w:r>
+      <w:r>
+        <w:t>*</w:t>
+      </w:r>
+      <w:r>
+        <w:rPr>
+          <w:lang w:val="en-US"/>
+        </w:rPr>
+        <w:t>K</w:t>
+      </w:r>
+      <w:r>
+        <w:t>+</w:t>
+      </w:r>
+      <w:r>
+        <w:rPr>
+          <w:lang w:val="en-US"/>
+        </w:rPr>
+        <w:t>B</w:t>
+      </w:r>
+      <w:r>
+        <w:t xml:space="preserve">). </w:t>
+      </w:r>
+      <w:r>
+        <w:t>Знак вычисляется с учётом машинной погрешности (порог</w:t>
+      </w:r>
+      <w:r>
+        <w:t xml:space="preserve"> </w:t>
+      </w:r>
+      <w:r>
+        <w:t>1e-12):</w:t>
+      </w:r>
+      <w:r>
+        <w:t xml:space="preserve"> </w:t>
+      </w:r>
+      <w:r>
+        <w:t>если</w:t>
       </w:r>
       <w:r>
         <w:t xml:space="preserve"> </w:t>
       </w:r>
       <w:proofErr w:type="spellStart"/>
       <w:r>
+        <w:t>sign</w:t>
+      </w:r>
+      <w:proofErr w:type="spellEnd"/>
+      <w:r>
+        <w:t>(</w:t>
+      </w:r>
+      <w:proofErr w:type="spellStart"/>
+      <w:r>
         <w:t>deltaC</w:t>
       </w:r>
       <w:proofErr w:type="spellEnd"/>
       <w:r>
-        <w:t xml:space="preserve"> = </w:t>
+        <w:t xml:space="preserve">) == </w:t>
       </w:r>
       <w:proofErr w:type="spellStart"/>
       <w:r>
-        <w:t>c.y</w:t>
+        <w:t>sign</w:t>
       </w:r>
       <w:proofErr w:type="spellEnd"/>
       <w:r>
-        <w:t xml:space="preserve"> </w:t>
-      </w:r>
-      <w:r>
-        <w:t>–</w:t>
-      </w:r>
-      <w:r>
-        <w:t xml:space="preserve"> </w:t>
-      </w:r>
-      <w:r>
         <w:t>(</w:t>
       </w:r>
-      <w:r>
-        <w:rPr>
-          <w:lang w:val="en-US"/>
-        </w:rPr>
-        <w:t>c</w:t>
-      </w:r>
-      <w:r>
-        <w:t>.</w:t>
-      </w:r>
-      <w:r>
-        <w:rPr>
-          <w:lang w:val="en-US"/>
-        </w:rPr>
-        <w:t>x</w:t>
-      </w:r>
-      <w:r>
-        <w:t>*</w:t>
-      </w:r>
-      <w:r>
-        <w:rPr>
-          <w:lang w:val="en-US"/>
-        </w:rPr>
-        <w:t>K</w:t>
-      </w:r>
-      <w:r>
-        <w:t>+</w:t>
-      </w:r>
-      <w:r>
-        <w:rPr>
-          <w:lang w:val="en-US"/>
-        </w:rPr>
-        <w:t>B</w:t>
-      </w:r>
+      <w:proofErr w:type="spellStart"/>
+      <w:r>
+        <w:t>deltaM</w:t>
+      </w:r>
+      <w:proofErr w:type="spellEnd"/>
       <w:r>
         <w:t>)</w:t>
       </w:r>
@@ -862,242 +946,122 @@
         <w:t xml:space="preserve"> </w:t>
       </w:r>
       <w:r>
+        <w:t>— точки</w:t>
+      </w:r>
+      <w:r>
+        <w:t xml:space="preserve"> </w:t>
+      </w:r>
+      <w:r>
+        <w:t>C</w:t>
+      </w:r>
+      <w:r>
+        <w:t xml:space="preserve"> </w:t>
+      </w:r>
+      <w:r>
         <w:t>и</w:t>
       </w:r>
       <w:r>
         <w:t xml:space="preserve"> </w:t>
       </w:r>
+      <w:r>
+        <w:t>M</w:t>
+      </w:r>
+      <w:r>
+        <w:t xml:space="preserve"> </w:t>
+      </w:r>
+      <w:r>
+        <w:t>по одну сторону от прямой, проверка пройдена;</w:t>
+      </w:r>
+      <w:r>
+        <w:t xml:space="preserve"> </w:t>
+      </w:r>
+      <w:r>
+        <w:t>есл</w:t>
+      </w:r>
+      <w:r>
+        <w:t xml:space="preserve">и </w:t>
+      </w:r>
       <w:proofErr w:type="spellStart"/>
       <w:r>
+        <w:t>sign</w:t>
+      </w:r>
+      <w:proofErr w:type="spellEnd"/>
+      <w:r>
+        <w:t>(</w:t>
+      </w:r>
+      <w:proofErr w:type="spellStart"/>
+      <w:r>
         <w:t>deltaM</w:t>
       </w:r>
       <w:proofErr w:type="spellEnd"/>
       <w:r>
-        <w:t xml:space="preserve"> = </w:t>
+        <w:t>) == 0</w:t>
+      </w:r>
+      <w:r>
+        <w:t xml:space="preserve"> </w:t>
+      </w:r>
+      <w:r>
+        <w:t>— точка</w:t>
+      </w:r>
+      <w:r>
+        <w:t xml:space="preserve"> </w:t>
+      </w:r>
+      <w:r>
+        <w:t>M</w:t>
+      </w:r>
+      <w:r>
+        <w:t xml:space="preserve"> </w:t>
+      </w:r>
+      <w:r>
+        <w:t>лежит на самой прямой, что считается попаданием на границу треугольника;</w:t>
+      </w:r>
+      <w:r>
+        <w:t xml:space="preserve"> </w:t>
+      </w:r>
+      <w:r>
+        <w:t>иначе — точки по разные стороны, проверка не пройдена.</w:t>
+      </w:r>
+      <w:r>
+        <w:t xml:space="preserve"> </w:t>
+      </w:r>
+      <w:r>
+        <w:t>Точка считается принадлежащей треугольнику, если</w:t>
+      </w:r>
+      <w:r>
+        <w:t xml:space="preserve"> </w:t>
+      </w:r>
+      <w:r>
+        <w:t>все три проверки</w:t>
+      </w:r>
+      <w:r>
+        <w:t xml:space="preserve"> </w:t>
+      </w:r>
+      <w:r>
+        <w:t>пройдены. В этом случае функция</w:t>
+      </w:r>
+      <w:r>
+        <w:t xml:space="preserve"> </w:t>
       </w:r>
       <w:proofErr w:type="spellStart"/>
       <w:r>
-        <w:t>m.y</w:t>
+        <w:t>in_triangle</w:t>
       </w:r>
       <w:proofErr w:type="spellEnd"/>
       <w:r>
         <w:t xml:space="preserve"> </w:t>
       </w:r>
       <w:r>
-        <w:t>–</w:t>
-      </w:r>
-      <w:r>
-        <w:t xml:space="preserve"> (</w:t>
-      </w:r>
-      <w:r>
-        <w:rPr>
-          <w:lang w:val="en-US"/>
-        </w:rPr>
-        <w:t>m</w:t>
-      </w:r>
-      <w:r>
-        <w:t>.</w:t>
-      </w:r>
-      <w:r>
-        <w:rPr>
-          <w:lang w:val="en-US"/>
-        </w:rPr>
-        <w:t>x</w:t>
-      </w:r>
-      <w:r>
-        <w:t>*</w:t>
-      </w:r>
-      <w:r>
-        <w:rPr>
-          <w:lang w:val="en-US"/>
-        </w:rPr>
-        <w:t>K</w:t>
-      </w:r>
-      <w:r>
-        <w:t>+</w:t>
-      </w:r>
-      <w:r>
-        <w:rPr>
-          <w:lang w:val="en-US"/>
-        </w:rPr>
-        <w:t>B</w:t>
-      </w:r>
-      <w:r>
-        <w:t xml:space="preserve">). </w:t>
-      </w:r>
-      <w:r>
-        <w:t>Знак вычисляется с учётом машинной погрешности (порог</w:t>
-      </w:r>
-      <w:r>
-        <w:t xml:space="preserve"> </w:t>
-      </w:r>
-      <w:r>
-        <w:t>1e-12</w:t>
-      </w:r>
-      <w:r>
-        <w:t>):</w:t>
-      </w:r>
-      <w:r>
-        <w:t xml:space="preserve"> </w:t>
-      </w:r>
-      <w:r>
-        <w:t>если</w:t>
+        <w:t>возвращает</w:t>
       </w:r>
       <w:r>
         <w:t xml:space="preserve"> </w:t>
       </w:r>
       <w:proofErr w:type="spellStart"/>
       <w:r>
-        <w:t>sign</w:t>
+        <w:t>true</w:t>
       </w:r>
       <w:proofErr w:type="spellEnd"/>
       <w:r>
-        <w:t>(</w:t>
-      </w:r>
-      <w:proofErr w:type="spellStart"/>
-      <w:r>
-        <w:t>deltaC</w:t>
-      </w:r>
-      <w:proofErr w:type="spellEnd"/>
-      <w:r>
-        <w:t xml:space="preserve">) == </w:t>
-      </w:r>
-      <w:proofErr w:type="spellStart"/>
-      <w:r>
-        <w:t>sign</w:t>
-      </w:r>
-      <w:proofErr w:type="spellEnd"/>
-      <w:r>
-        <w:t>(</w:t>
-      </w:r>
-      <w:proofErr w:type="spellStart"/>
-      <w:r>
-        <w:t>deltaM</w:t>
-      </w:r>
-      <w:proofErr w:type="spellEnd"/>
-      <w:r>
-        <w:t>)</w:t>
-      </w:r>
-      <w:r>
-        <w:t xml:space="preserve"> </w:t>
-      </w:r>
-      <w:r>
-        <w:t>— точки</w:t>
-      </w:r>
-      <w:r>
-        <w:t xml:space="preserve"> </w:t>
-      </w:r>
-      <w:r>
-        <w:t>C</w:t>
-      </w:r>
-      <w:r>
-        <w:t xml:space="preserve"> </w:t>
-      </w:r>
-      <w:r>
-        <w:t>и</w:t>
-      </w:r>
-      <w:r>
-        <w:t xml:space="preserve"> </w:t>
-      </w:r>
-      <w:r>
-        <w:t>M</w:t>
-      </w:r>
-      <w:r>
-        <w:t xml:space="preserve"> </w:t>
-      </w:r>
-      <w:r>
-        <w:t>по одну сторону от прямой, проверка пройдена;</w:t>
-      </w:r>
-      <w:r>
-        <w:t xml:space="preserve"> </w:t>
-      </w:r>
-      <w:r>
-        <w:t>есл</w:t>
-      </w:r>
-      <w:r>
-        <w:t xml:space="preserve">и </w:t>
-      </w:r>
-      <w:proofErr w:type="spellStart"/>
-      <w:r>
-        <w:t>sign</w:t>
-      </w:r>
-      <w:proofErr w:type="spellEnd"/>
-      <w:r>
-        <w:t>(</w:t>
-      </w:r>
-      <w:proofErr w:type="spellStart"/>
-      <w:r>
-        <w:t>deltaM</w:t>
-      </w:r>
-      <w:proofErr w:type="spellEnd"/>
-      <w:r>
-        <w:t>) == 0</w:t>
-      </w:r>
-      <w:r>
-        <w:t xml:space="preserve"> </w:t>
-      </w:r>
-      <w:r>
-        <w:t>— точка</w:t>
-      </w:r>
-      <w:r>
-        <w:t xml:space="preserve"> </w:t>
-      </w:r>
-      <w:r>
-        <w:t>M</w:t>
-      </w:r>
-      <w:r>
-        <w:t xml:space="preserve"> </w:t>
-      </w:r>
-      <w:r>
-        <w:t>лежит на самой прямой, что считается попаданием на границу треугольника;</w:t>
-      </w:r>
-      <w:r>
-        <w:t xml:space="preserve"> </w:t>
-      </w:r>
-      <w:r>
-        <w:t>иначе — точки по разные стороны, проверка не пройдена.</w:t>
-      </w:r>
-      <w:r>
-        <w:t xml:space="preserve"> </w:t>
-      </w:r>
-      <w:r>
-        <w:t>Точка считается принадлежащей треугольнику, если</w:t>
-      </w:r>
-      <w:r>
-        <w:t xml:space="preserve"> </w:t>
-      </w:r>
-      <w:r>
-        <w:t>все три проверки</w:t>
-      </w:r>
-      <w:r>
-        <w:t xml:space="preserve"> </w:t>
-      </w:r>
-      <w:r>
-        <w:t>пройдены. В этом случае функция</w:t>
-      </w:r>
-      <w:r>
-        <w:t xml:space="preserve"> </w:t>
-      </w:r>
-      <w:proofErr w:type="spellStart"/>
-      <w:r>
-        <w:t>in_triangle</w:t>
-      </w:r>
-      <w:proofErr w:type="spellEnd"/>
-      <w:r>
-        <w:t xml:space="preserve"> </w:t>
-      </w:r>
-      <w:r>
-        <w:t>возвращает</w:t>
-      </w:r>
-      <w:r>
-        <w:t xml:space="preserve"> </w:t>
-      </w:r>
-      <w:proofErr w:type="spellStart"/>
-      <w:r>
-        <w:t>true</w:t>
-      </w:r>
-      <w:proofErr w:type="spellEnd"/>
-      <w:r>
         <w:t>, и на экран выводится сообщение</w:t>
       </w:r>
       <w:r>
@@ -1116,10 +1080,7 @@
         <w:t xml:space="preserve"> </w:t>
       </w:r>
       <w:r>
-        <w:t>«NO»</w:t>
-      </w:r>
-      <w:r>
-        <w:t>.</w:t>
+        <w:t>«NO».</w:t>
       </w:r>
       <w:r>
         <w:t xml:space="preserve"> </w:t>
@@ -1160,11 +1121,17 @@
       <w:pPr>
         <w:pStyle w:val="1"/>
         <w:jc w:val="left"/>
+        <w:rPr>
+          <w:lang w:val="en-US"/>
+        </w:rPr>
       </w:pPr>
       <w:r>
         <w:t>Текст</w:t>
       </w:r>
       <w:r>
+        <w:rPr>
+          <w:lang w:val="en-US"/>
+        </w:rPr>
         <w:t xml:space="preserve"> </w:t>
       </w:r>
       <w:r>
@@ -1195,33 +1162,6 @@
           <w:szCs w:val="19"/>
           <w:lang w:val="ru-US"/>
         </w:rPr>
-        <w:t>#include"lab1.h"</w:t>
-      </w:r>
-    </w:p>
-    <w:p>
-      <w:pPr>
-        <w:pStyle w:val="1"/>
-        <w:jc w:val="left"/>
-        <w:rPr>
-          <w:rFonts w:ascii="JetBrains Mono" w:hAnsi="JetBrains Mono" w:cs="JetBrains Mono"/>
-          <w:b w:val="0"/>
-          <w:bCs w:val="0"/>
-          <w:color w:val="000000" w:themeColor="text1"/>
-          <w:sz w:val="19"/>
-          <w:szCs w:val="19"/>
-          <w:lang w:val="ru-US"/>
-        </w:rPr>
-      </w:pPr>
-      <w:r>
-        <w:rPr>
-          <w:rFonts w:ascii="JetBrains Mono" w:hAnsi="JetBrains Mono" w:cs="JetBrains Mono"/>
-          <w:b w:val="0"/>
-          <w:bCs w:val="0"/>
-          <w:color w:val="000000" w:themeColor="text1"/>
-          <w:sz w:val="19"/>
-          <w:szCs w:val="19"/>
-          <w:lang w:val="ru-US"/>
-        </w:rPr>
         <w:t>#include&lt;iostream&gt;</w:t>
       </w:r>
     </w:p>
@@ -1249,6 +1189,306 @@
           <w:szCs w:val="19"/>
           <w:lang w:val="ru-US"/>
         </w:rPr>
+        <w:t>#include&lt;vector&gt;</w:t>
+      </w:r>
+    </w:p>
+    <w:p>
+      <w:pPr>
+        <w:pStyle w:val="1"/>
+        <w:jc w:val="left"/>
+        <w:rPr>
+          <w:rFonts w:ascii="JetBrains Mono" w:hAnsi="JetBrains Mono" w:cs="JetBrains Mono"/>
+          <w:b w:val="0"/>
+          <w:bCs w:val="0"/>
+          <w:color w:val="000000" w:themeColor="text1"/>
+          <w:sz w:val="19"/>
+          <w:szCs w:val="19"/>
+          <w:lang w:val="ru-US"/>
+        </w:rPr>
+      </w:pPr>
+    </w:p>
+    <w:p>
+      <w:pPr>
+        <w:pStyle w:val="1"/>
+        <w:jc w:val="left"/>
+        <w:rPr>
+          <w:rFonts w:ascii="JetBrains Mono" w:hAnsi="JetBrains Mono" w:cs="JetBrains Mono"/>
+          <w:b w:val="0"/>
+          <w:bCs w:val="0"/>
+          <w:color w:val="000000" w:themeColor="text1"/>
+          <w:sz w:val="19"/>
+          <w:szCs w:val="19"/>
+          <w:lang w:val="ru-US"/>
+        </w:rPr>
+      </w:pPr>
+      <w:r>
+        <w:rPr>
+          <w:rFonts w:ascii="JetBrains Mono" w:hAnsi="JetBrains Mono" w:cs="JetBrains Mono"/>
+          <w:b w:val="0"/>
+          <w:bCs w:val="0"/>
+          <w:color w:val="000000" w:themeColor="text1"/>
+          <w:sz w:val="19"/>
+          <w:szCs w:val="19"/>
+          <w:lang w:val="ru-US"/>
+        </w:rPr>
+        <w:t>// Структура для хранения точки на плоскости.</w:t>
+      </w:r>
+    </w:p>
+    <w:p>
+      <w:pPr>
+        <w:pStyle w:val="1"/>
+        <w:jc w:val="left"/>
+        <w:rPr>
+          <w:rFonts w:ascii="JetBrains Mono" w:hAnsi="JetBrains Mono" w:cs="JetBrains Mono"/>
+          <w:b w:val="0"/>
+          <w:bCs w:val="0"/>
+          <w:color w:val="000000" w:themeColor="text1"/>
+          <w:sz w:val="19"/>
+          <w:szCs w:val="19"/>
+          <w:lang w:val="ru-US"/>
+        </w:rPr>
+      </w:pPr>
+      <w:r>
+        <w:rPr>
+          <w:rFonts w:ascii="JetBrains Mono" w:hAnsi="JetBrains Mono" w:cs="JetBrains Mono"/>
+          <w:b w:val="0"/>
+          <w:bCs w:val="0"/>
+          <w:color w:val="000000" w:themeColor="text1"/>
+          <w:sz w:val="19"/>
+          <w:szCs w:val="19"/>
+          <w:lang w:val="ru-US"/>
+        </w:rPr>
+        <w:t>// Координаты — long double для большей точности вычислений.</w:t>
+      </w:r>
+    </w:p>
+    <w:p>
+      <w:pPr>
+        <w:pStyle w:val="1"/>
+        <w:jc w:val="left"/>
+        <w:rPr>
+          <w:rFonts w:ascii="JetBrains Mono" w:hAnsi="JetBrains Mono" w:cs="JetBrains Mono"/>
+          <w:b w:val="0"/>
+          <w:bCs w:val="0"/>
+          <w:color w:val="000000" w:themeColor="text1"/>
+          <w:sz w:val="19"/>
+          <w:szCs w:val="19"/>
+          <w:lang w:val="ru-US"/>
+        </w:rPr>
+      </w:pPr>
+      <w:r>
+        <w:rPr>
+          <w:rFonts w:ascii="JetBrains Mono" w:hAnsi="JetBrains Mono" w:cs="JetBrains Mono"/>
+          <w:b w:val="0"/>
+          <w:bCs w:val="0"/>
+          <w:color w:val="000000" w:themeColor="text1"/>
+          <w:sz w:val="19"/>
+          <w:szCs w:val="19"/>
+          <w:lang w:val="ru-US"/>
+        </w:rPr>
+        <w:t>struct Point {</w:t>
+      </w:r>
+    </w:p>
+    <w:p>
+      <w:pPr>
+        <w:pStyle w:val="1"/>
+        <w:jc w:val="left"/>
+        <w:rPr>
+          <w:rFonts w:ascii="JetBrains Mono" w:hAnsi="JetBrains Mono" w:cs="JetBrains Mono"/>
+          <w:b w:val="0"/>
+          <w:bCs w:val="0"/>
+          <w:color w:val="000000" w:themeColor="text1"/>
+          <w:sz w:val="19"/>
+          <w:szCs w:val="19"/>
+          <w:lang w:val="ru-US"/>
+        </w:rPr>
+      </w:pPr>
+      <w:r>
+        <w:rPr>
+          <w:rFonts w:ascii="JetBrains Mono" w:hAnsi="JetBrains Mono" w:cs="JetBrains Mono"/>
+          <w:b w:val="0"/>
+          <w:bCs w:val="0"/>
+          <w:color w:val="000000" w:themeColor="text1"/>
+          <w:sz w:val="19"/>
+          <w:szCs w:val="19"/>
+          <w:lang w:val="ru-US"/>
+        </w:rPr>
+        <w:t xml:space="preserve">    long double x, y;</w:t>
+      </w:r>
+    </w:p>
+    <w:p>
+      <w:pPr>
+        <w:pStyle w:val="1"/>
+        <w:jc w:val="left"/>
+        <w:rPr>
+          <w:rFonts w:ascii="JetBrains Mono" w:hAnsi="JetBrains Mono" w:cs="JetBrains Mono"/>
+          <w:b w:val="0"/>
+          <w:bCs w:val="0"/>
+          <w:color w:val="000000" w:themeColor="text1"/>
+          <w:sz w:val="19"/>
+          <w:szCs w:val="19"/>
+          <w:lang w:val="ru-US"/>
+        </w:rPr>
+      </w:pPr>
+      <w:r>
+        <w:rPr>
+          <w:rFonts w:ascii="JetBrains Mono" w:hAnsi="JetBrains Mono" w:cs="JetBrains Mono"/>
+          <w:b w:val="0"/>
+          <w:bCs w:val="0"/>
+          <w:color w:val="000000" w:themeColor="text1"/>
+          <w:sz w:val="19"/>
+          <w:szCs w:val="19"/>
+          <w:lang w:val="ru-US"/>
+        </w:rPr>
+        <w:t xml:space="preserve">    Point(long double x_val, long double y_val) : x(x_val), y(y_val) {}</w:t>
+      </w:r>
+    </w:p>
+    <w:p>
+      <w:pPr>
+        <w:pStyle w:val="1"/>
+        <w:jc w:val="left"/>
+        <w:rPr>
+          <w:rFonts w:ascii="JetBrains Mono" w:hAnsi="JetBrains Mono" w:cs="JetBrains Mono"/>
+          <w:b w:val="0"/>
+          <w:bCs w:val="0"/>
+          <w:color w:val="000000" w:themeColor="text1"/>
+          <w:sz w:val="19"/>
+          <w:szCs w:val="19"/>
+          <w:lang w:val="ru-US"/>
+        </w:rPr>
+      </w:pPr>
+      <w:r>
+        <w:rPr>
+          <w:rFonts w:ascii="JetBrains Mono" w:hAnsi="JetBrains Mono" w:cs="JetBrains Mono"/>
+          <w:b w:val="0"/>
+          <w:bCs w:val="0"/>
+          <w:color w:val="000000" w:themeColor="text1"/>
+          <w:sz w:val="19"/>
+          <w:szCs w:val="19"/>
+          <w:lang w:val="ru-US"/>
+        </w:rPr>
+        <w:t>};</w:t>
+      </w:r>
+    </w:p>
+    <w:p>
+      <w:pPr>
+        <w:pStyle w:val="1"/>
+        <w:jc w:val="left"/>
+        <w:rPr>
+          <w:rFonts w:ascii="JetBrains Mono" w:hAnsi="JetBrains Mono" w:cs="JetBrains Mono"/>
+          <w:b w:val="0"/>
+          <w:bCs w:val="0"/>
+          <w:color w:val="000000" w:themeColor="text1"/>
+          <w:sz w:val="19"/>
+          <w:szCs w:val="19"/>
+          <w:lang w:val="ru-US"/>
+        </w:rPr>
+      </w:pPr>
+    </w:p>
+    <w:p>
+      <w:pPr>
+        <w:pStyle w:val="1"/>
+        <w:jc w:val="left"/>
+        <w:rPr>
+          <w:rFonts w:ascii="JetBrains Mono" w:hAnsi="JetBrains Mono" w:cs="JetBrains Mono"/>
+          <w:b w:val="0"/>
+          <w:bCs w:val="0"/>
+          <w:color w:val="000000" w:themeColor="text1"/>
+          <w:sz w:val="19"/>
+          <w:szCs w:val="19"/>
+          <w:lang w:val="ru-US"/>
+        </w:rPr>
+      </w:pPr>
+      <w:r>
+        <w:rPr>
+          <w:rFonts w:ascii="JetBrains Mono" w:hAnsi="JetBrains Mono" w:cs="JetBrains Mono"/>
+          <w:b w:val="0"/>
+          <w:bCs w:val="0"/>
+          <w:color w:val="000000" w:themeColor="text1"/>
+          <w:sz w:val="19"/>
+          <w:szCs w:val="19"/>
+          <w:lang w:val="ru-US"/>
+        </w:rPr>
+        <w:t>// Возвращает знак числа: -1, 0 или 1.</w:t>
+      </w:r>
+    </w:p>
+    <w:p>
+      <w:pPr>
+        <w:pStyle w:val="1"/>
+        <w:jc w:val="left"/>
+        <w:rPr>
+          <w:rFonts w:ascii="JetBrains Mono" w:hAnsi="JetBrains Mono" w:cs="JetBrains Mono"/>
+          <w:b w:val="0"/>
+          <w:bCs w:val="0"/>
+          <w:color w:val="000000" w:themeColor="text1"/>
+          <w:sz w:val="19"/>
+          <w:szCs w:val="19"/>
+          <w:lang w:val="ru-US"/>
+        </w:rPr>
+      </w:pPr>
+      <w:r>
+        <w:rPr>
+          <w:rFonts w:ascii="JetBrains Mono" w:hAnsi="JetBrains Mono" w:cs="JetBrains Mono"/>
+          <w:b w:val="0"/>
+          <w:bCs w:val="0"/>
+          <w:color w:val="000000" w:themeColor="text1"/>
+          <w:sz w:val="19"/>
+          <w:szCs w:val="19"/>
+          <w:lang w:val="ru-US"/>
+        </w:rPr>
+        <w:t>// Сравнение с эпсилон (1e-12) вместо == 0 нужно, чтобы избежать</w:t>
+      </w:r>
+    </w:p>
+    <w:p>
+      <w:pPr>
+        <w:pStyle w:val="1"/>
+        <w:jc w:val="left"/>
+        <w:rPr>
+          <w:rFonts w:ascii="JetBrains Mono" w:hAnsi="JetBrains Mono" w:cs="JetBrains Mono"/>
+          <w:b w:val="0"/>
+          <w:bCs w:val="0"/>
+          <w:color w:val="000000" w:themeColor="text1"/>
+          <w:sz w:val="19"/>
+          <w:szCs w:val="19"/>
+          <w:lang w:val="ru-US"/>
+        </w:rPr>
+      </w:pPr>
+      <w:r>
+        <w:rPr>
+          <w:rFonts w:ascii="JetBrains Mono" w:hAnsi="JetBrains Mono" w:cs="JetBrains Mono"/>
+          <w:b w:val="0"/>
+          <w:bCs w:val="0"/>
+          <w:color w:val="000000" w:themeColor="text1"/>
+          <w:sz w:val="19"/>
+          <w:szCs w:val="19"/>
+          <w:lang w:val="ru-US"/>
+        </w:rPr>
+        <w:t>// ошибок из-за погрешности вычислений с плавающей точкой.</w:t>
+      </w:r>
+    </w:p>
+    <w:p>
+      <w:pPr>
+        <w:pStyle w:val="1"/>
+        <w:jc w:val="left"/>
+        <w:rPr>
+          <w:rFonts w:ascii="JetBrains Mono" w:hAnsi="JetBrains Mono" w:cs="JetBrains Mono"/>
+          <w:b w:val="0"/>
+          <w:bCs w:val="0"/>
+          <w:color w:val="000000" w:themeColor="text1"/>
+          <w:sz w:val="19"/>
+          <w:szCs w:val="19"/>
+          <w:lang w:val="ru-US"/>
+        </w:rPr>
+      </w:pPr>
+      <w:r>
+        <w:rPr>
+          <w:rFonts w:ascii="JetBrains Mono" w:hAnsi="JetBrains Mono" w:cs="JetBrains Mono"/>
+          <w:b w:val="0"/>
+          <w:bCs w:val="0"/>
+          <w:color w:val="000000" w:themeColor="text1"/>
+          <w:sz w:val="19"/>
+          <w:szCs w:val="19"/>
+          <w:lang w:val="ru-US"/>
+        </w:rPr>
         <w:t>int sign(long double x){</w:t>
       </w:r>
     </w:p>
@@ -1347,16 +1587,167 @@
           <w:lang w:val="ru-US"/>
         </w:rPr>
       </w:pPr>
-      <w:r>
-        <w:rPr>
-          <w:rFonts w:ascii="JetBrains Mono" w:hAnsi="JetBrains Mono" w:cs="JetBrains Mono"/>
-          <w:b w:val="0"/>
-          <w:bCs w:val="0"/>
-          <w:color w:val="000000" w:themeColor="text1"/>
-          <w:sz w:val="19"/>
-          <w:szCs w:val="19"/>
-          <w:lang w:val="ru-US"/>
-        </w:rPr>
+    </w:p>
+    <w:p>
+      <w:pPr>
+        <w:pStyle w:val="1"/>
+        <w:jc w:val="left"/>
+        <w:rPr>
+          <w:rFonts w:ascii="JetBrains Mono" w:hAnsi="JetBrains Mono" w:cs="JetBrains Mono"/>
+          <w:b w:val="0"/>
+          <w:bCs w:val="0"/>
+          <w:color w:val="000000" w:themeColor="text1"/>
+          <w:sz w:val="19"/>
+          <w:szCs w:val="19"/>
+          <w:lang w:val="ru-US"/>
+        </w:rPr>
+      </w:pPr>
+      <w:r>
+        <w:rPr>
+          <w:rFonts w:ascii="JetBrains Mono" w:hAnsi="JetBrains Mono" w:cs="JetBrains Mono"/>
+          <w:b w:val="0"/>
+          <w:bCs w:val="0"/>
+          <w:color w:val="000000" w:themeColor="text1"/>
+          <w:sz w:val="19"/>
+          <w:szCs w:val="19"/>
+          <w:lang w:val="ru-US"/>
+        </w:rPr>
+        <w:t>// Проверяет, лежат ли точки c и m по одну сторону от прямой,</w:t>
+      </w:r>
+    </w:p>
+    <w:p>
+      <w:pPr>
+        <w:pStyle w:val="1"/>
+        <w:jc w:val="left"/>
+        <w:rPr>
+          <w:rFonts w:ascii="JetBrains Mono" w:hAnsi="JetBrains Mono" w:cs="JetBrains Mono"/>
+          <w:b w:val="0"/>
+          <w:bCs w:val="0"/>
+          <w:color w:val="000000" w:themeColor="text1"/>
+          <w:sz w:val="19"/>
+          <w:szCs w:val="19"/>
+          <w:lang w:val="ru-US"/>
+        </w:rPr>
+      </w:pPr>
+      <w:r>
+        <w:rPr>
+          <w:rFonts w:ascii="JetBrains Mono" w:hAnsi="JetBrains Mono" w:cs="JetBrains Mono"/>
+          <w:b w:val="0"/>
+          <w:bCs w:val="0"/>
+          <w:color w:val="000000" w:themeColor="text1"/>
+          <w:sz w:val="19"/>
+          <w:szCs w:val="19"/>
+          <w:lang w:val="ru-US"/>
+        </w:rPr>
+        <w:t>// проходящей через точки a и b (либо m лежит прямо на прямой).</w:t>
+      </w:r>
+    </w:p>
+    <w:p>
+      <w:pPr>
+        <w:pStyle w:val="1"/>
+        <w:jc w:val="left"/>
+        <w:rPr>
+          <w:rFonts w:ascii="JetBrains Mono" w:hAnsi="JetBrains Mono" w:cs="JetBrains Mono"/>
+          <w:b w:val="0"/>
+          <w:bCs w:val="0"/>
+          <w:color w:val="000000" w:themeColor="text1"/>
+          <w:sz w:val="19"/>
+          <w:szCs w:val="19"/>
+          <w:lang w:val="ru-US"/>
+        </w:rPr>
+      </w:pPr>
+      <w:r>
+        <w:rPr>
+          <w:rFonts w:ascii="JetBrains Mono" w:hAnsi="JetBrains Mono" w:cs="JetBrains Mono"/>
+          <w:b w:val="0"/>
+          <w:bCs w:val="0"/>
+          <w:color w:val="000000" w:themeColor="text1"/>
+          <w:sz w:val="19"/>
+          <w:szCs w:val="19"/>
+          <w:lang w:val="ru-US"/>
+        </w:rPr>
+        <w:t>// Используется для проверки принадлежности точки треугольнику:</w:t>
+      </w:r>
+    </w:p>
+    <w:p>
+      <w:pPr>
+        <w:pStyle w:val="1"/>
+        <w:jc w:val="left"/>
+        <w:rPr>
+          <w:rFonts w:ascii="JetBrains Mono" w:hAnsi="JetBrains Mono" w:cs="JetBrains Mono"/>
+          <w:b w:val="0"/>
+          <w:bCs w:val="0"/>
+          <w:color w:val="000000" w:themeColor="text1"/>
+          <w:sz w:val="19"/>
+          <w:szCs w:val="19"/>
+          <w:lang w:val="ru-US"/>
+        </w:rPr>
+      </w:pPr>
+      <w:r>
+        <w:rPr>
+          <w:rFonts w:ascii="JetBrains Mono" w:hAnsi="JetBrains Mono" w:cs="JetBrains Mono"/>
+          <w:b w:val="0"/>
+          <w:bCs w:val="0"/>
+          <w:color w:val="000000" w:themeColor="text1"/>
+          <w:sz w:val="19"/>
+          <w:szCs w:val="19"/>
+          <w:lang w:val="ru-US"/>
+        </w:rPr>
+        <w:t>// если точка p лежит по ту же сторону от каждой стороны треугольника,</w:t>
+      </w:r>
+    </w:p>
+    <w:p>
+      <w:pPr>
+        <w:pStyle w:val="1"/>
+        <w:jc w:val="left"/>
+        <w:rPr>
+          <w:rFonts w:ascii="JetBrains Mono" w:hAnsi="JetBrains Mono" w:cs="JetBrains Mono"/>
+          <w:b w:val="0"/>
+          <w:bCs w:val="0"/>
+          <w:color w:val="000000" w:themeColor="text1"/>
+          <w:sz w:val="19"/>
+          <w:szCs w:val="19"/>
+          <w:lang w:val="ru-US"/>
+        </w:rPr>
+      </w:pPr>
+      <w:r>
+        <w:rPr>
+          <w:rFonts w:ascii="JetBrains Mono" w:hAnsi="JetBrains Mono" w:cs="JetBrains Mono"/>
+          <w:b w:val="0"/>
+          <w:bCs w:val="0"/>
+          <w:color w:val="000000" w:themeColor="text1"/>
+          <w:sz w:val="19"/>
+          <w:szCs w:val="19"/>
+          <w:lang w:val="ru-US"/>
+        </w:rPr>
+        <w:t>// что и противоположная вершина — точка внутри треугольника.</w:t>
+      </w:r>
+    </w:p>
+    <w:p>
+      <w:pPr>
+        <w:pStyle w:val="1"/>
+        <w:jc w:val="left"/>
+        <w:rPr>
+          <w:rFonts w:ascii="JetBrains Mono" w:hAnsi="JetBrains Mono" w:cs="JetBrains Mono"/>
+          <w:b w:val="0"/>
+          <w:bCs w:val="0"/>
+          <w:color w:val="000000" w:themeColor="text1"/>
+          <w:sz w:val="19"/>
+          <w:szCs w:val="19"/>
+          <w:lang w:val="ru-US"/>
+        </w:rPr>
+      </w:pPr>
+      <w:r>
+        <w:rPr>
+          <w:rFonts w:ascii="JetBrains Mono" w:hAnsi="JetBrains Mono" w:cs="JetBrains Mono"/>
+          <w:b w:val="0"/>
+          <w:bCs w:val="0"/>
+          <w:color w:val="000000" w:themeColor="text1"/>
+          <w:sz w:val="19"/>
+          <w:szCs w:val="19"/>
+          <w:lang w:val="ru-US"/>
+        </w:rPr>
+        <w:lastRenderedPageBreak/>
         <w:t>int valid(Point &amp;a, Point &amp;b, Point &amp;c, Point &amp;m) {</w:t>
       </w:r>
     </w:p>
@@ -1384,7 +1775,7 @@
           <w:szCs w:val="19"/>
           <w:lang w:val="ru-US"/>
         </w:rPr>
-        <w:t xml:space="preserve">    long double deltaC, deltaM;</w:t>
+        <w:t xml:space="preserve">    long double deltaC, deltaM; // отклонения точек c и m от прямой ab</w:t>
       </w:r>
     </w:p>
     <w:p>
@@ -1453,6 +1844,87 @@
           <w:szCs w:val="19"/>
           <w:lang w:val="ru-US"/>
         </w:rPr>
+        <w:t xml:space="preserve">        // Прямая ab вертикальная (x = const) — уравнение прямой</w:t>
+      </w:r>
+    </w:p>
+    <w:p>
+      <w:pPr>
+        <w:pStyle w:val="1"/>
+        <w:jc w:val="left"/>
+        <w:rPr>
+          <w:rFonts w:ascii="JetBrains Mono" w:hAnsi="JetBrains Mono" w:cs="JetBrains Mono"/>
+          <w:b w:val="0"/>
+          <w:bCs w:val="0"/>
+          <w:color w:val="000000" w:themeColor="text1"/>
+          <w:sz w:val="19"/>
+          <w:szCs w:val="19"/>
+          <w:lang w:val="ru-US"/>
+        </w:rPr>
+      </w:pPr>
+      <w:r>
+        <w:rPr>
+          <w:rFonts w:ascii="JetBrains Mono" w:hAnsi="JetBrains Mono" w:cs="JetBrains Mono"/>
+          <w:b w:val="0"/>
+          <w:bCs w:val="0"/>
+          <w:color w:val="000000" w:themeColor="text1"/>
+          <w:sz w:val="19"/>
+          <w:szCs w:val="19"/>
+          <w:lang w:val="ru-US"/>
+        </w:rPr>
+        <w:t xml:space="preserve">        // через угловой коэффициент K не годится (деление на 0),</w:t>
+      </w:r>
+    </w:p>
+    <w:p>
+      <w:pPr>
+        <w:pStyle w:val="1"/>
+        <w:jc w:val="left"/>
+        <w:rPr>
+          <w:rFonts w:ascii="JetBrains Mono" w:hAnsi="JetBrains Mono" w:cs="JetBrains Mono"/>
+          <w:b w:val="0"/>
+          <w:bCs w:val="0"/>
+          <w:color w:val="000000" w:themeColor="text1"/>
+          <w:sz w:val="19"/>
+          <w:szCs w:val="19"/>
+          <w:lang w:val="ru-US"/>
+        </w:rPr>
+      </w:pPr>
+      <w:r>
+        <w:rPr>
+          <w:rFonts w:ascii="JetBrains Mono" w:hAnsi="JetBrains Mono" w:cs="JetBrains Mono"/>
+          <w:b w:val="0"/>
+          <w:bCs w:val="0"/>
+          <w:color w:val="000000" w:themeColor="text1"/>
+          <w:sz w:val="19"/>
+          <w:szCs w:val="19"/>
+          <w:lang w:val="ru-US"/>
+        </w:rPr>
+        <w:t xml:space="preserve">        // поэтому сравниваем напрямую по координате x.</w:t>
+      </w:r>
+    </w:p>
+    <w:p>
+      <w:pPr>
+        <w:pStyle w:val="1"/>
+        <w:jc w:val="left"/>
+        <w:rPr>
+          <w:rFonts w:ascii="JetBrains Mono" w:hAnsi="JetBrains Mono" w:cs="JetBrains Mono"/>
+          <w:b w:val="0"/>
+          <w:bCs w:val="0"/>
+          <w:color w:val="000000" w:themeColor="text1"/>
+          <w:sz w:val="19"/>
+          <w:szCs w:val="19"/>
+          <w:lang w:val="ru-US"/>
+        </w:rPr>
+      </w:pPr>
+      <w:r>
+        <w:rPr>
+          <w:rFonts w:ascii="JetBrains Mono" w:hAnsi="JetBrains Mono" w:cs="JetBrains Mono"/>
+          <w:b w:val="0"/>
+          <w:bCs w:val="0"/>
+          <w:color w:val="000000" w:themeColor="text1"/>
+          <w:sz w:val="19"/>
+          <w:szCs w:val="19"/>
+          <w:lang w:val="ru-US"/>
+        </w:rPr>
         <w:t xml:space="preserve">        deltaC = c.x - a.x;</w:t>
       </w:r>
     </w:p>
@@ -1467,7 +1939,7 @@
           <w:color w:val="000000" w:themeColor="text1"/>
           <w:sz w:val="19"/>
           <w:szCs w:val="19"/>
-          <w:lang w:val="en-US"/>
+          <w:lang w:val="ru-US"/>
         </w:rPr>
       </w:pPr>
       <w:r>
@@ -1534,34 +2006,184 @@
           <w:szCs w:val="19"/>
           <w:lang w:val="ru-US"/>
         </w:rPr>
-        <w:t xml:space="preserve">        long double K = (a.y - b.y) / (a.x - b.x);</w:t>
-      </w:r>
-    </w:p>
-    <w:p>
-      <w:pPr>
-        <w:pStyle w:val="1"/>
-        <w:jc w:val="left"/>
-        <w:rPr>
-          <w:rFonts w:ascii="JetBrains Mono" w:hAnsi="JetBrains Mono" w:cs="JetBrains Mono"/>
-          <w:b w:val="0"/>
-          <w:bCs w:val="0"/>
-          <w:color w:val="000000" w:themeColor="text1"/>
-          <w:sz w:val="19"/>
-          <w:szCs w:val="19"/>
-          <w:lang w:val="ru-US"/>
-        </w:rPr>
-      </w:pPr>
-      <w:r>
-        <w:rPr>
-          <w:rFonts w:ascii="JetBrains Mono" w:hAnsi="JetBrains Mono" w:cs="JetBrains Mono"/>
-          <w:b w:val="0"/>
-          <w:bCs w:val="0"/>
-          <w:color w:val="000000" w:themeColor="text1"/>
-          <w:sz w:val="19"/>
-          <w:szCs w:val="19"/>
-          <w:lang w:val="ru-US"/>
-        </w:rPr>
-        <w:t xml:space="preserve">        long double B = a.y - K * a.x;</w:t>
+        <w:t xml:space="preserve">        // Обычный случай: строим прямую вида y = K*x + B</w:t>
+      </w:r>
+    </w:p>
+    <w:p>
+      <w:pPr>
+        <w:pStyle w:val="1"/>
+        <w:jc w:val="left"/>
+        <w:rPr>
+          <w:rFonts w:ascii="JetBrains Mono" w:hAnsi="JetBrains Mono" w:cs="JetBrains Mono"/>
+          <w:b w:val="0"/>
+          <w:bCs w:val="0"/>
+          <w:color w:val="000000" w:themeColor="text1"/>
+          <w:sz w:val="19"/>
+          <w:szCs w:val="19"/>
+          <w:lang w:val="ru-US"/>
+        </w:rPr>
+      </w:pPr>
+      <w:r>
+        <w:rPr>
+          <w:rFonts w:ascii="JetBrains Mono" w:hAnsi="JetBrains Mono" w:cs="JetBrains Mono"/>
+          <w:b w:val="0"/>
+          <w:bCs w:val="0"/>
+          <w:color w:val="000000" w:themeColor="text1"/>
+          <w:sz w:val="19"/>
+          <w:szCs w:val="19"/>
+          <w:lang w:val="ru-US"/>
+        </w:rPr>
+        <w:t xml:space="preserve">        // через точки a и b.</w:t>
+      </w:r>
+    </w:p>
+    <w:p>
+      <w:pPr>
+        <w:pStyle w:val="1"/>
+        <w:jc w:val="left"/>
+        <w:rPr>
+          <w:rFonts w:ascii="JetBrains Mono" w:hAnsi="JetBrains Mono" w:cs="JetBrains Mono"/>
+          <w:b w:val="0"/>
+          <w:bCs w:val="0"/>
+          <w:color w:val="000000" w:themeColor="text1"/>
+          <w:sz w:val="19"/>
+          <w:szCs w:val="19"/>
+          <w:lang w:val="ru-US"/>
+        </w:rPr>
+      </w:pPr>
+      <w:r>
+        <w:rPr>
+          <w:rFonts w:ascii="JetBrains Mono" w:hAnsi="JetBrains Mono" w:cs="JetBrains Mono"/>
+          <w:b w:val="0"/>
+          <w:bCs w:val="0"/>
+          <w:color w:val="000000" w:themeColor="text1"/>
+          <w:sz w:val="19"/>
+          <w:szCs w:val="19"/>
+          <w:lang w:val="ru-US"/>
+        </w:rPr>
+        <w:t xml:space="preserve">        long double K = (a.y - b.y) / (a.x - b.x); // угловой коэффициент</w:t>
+      </w:r>
+    </w:p>
+    <w:p>
+      <w:pPr>
+        <w:pStyle w:val="1"/>
+        <w:jc w:val="left"/>
+        <w:rPr>
+          <w:rFonts w:ascii="JetBrains Mono" w:hAnsi="JetBrains Mono" w:cs="JetBrains Mono"/>
+          <w:b w:val="0"/>
+          <w:bCs w:val="0"/>
+          <w:color w:val="000000" w:themeColor="text1"/>
+          <w:sz w:val="19"/>
+          <w:szCs w:val="19"/>
+          <w:lang w:val="ru-US"/>
+        </w:rPr>
+      </w:pPr>
+      <w:r>
+        <w:rPr>
+          <w:rFonts w:ascii="JetBrains Mono" w:hAnsi="JetBrains Mono" w:cs="JetBrains Mono"/>
+          <w:b w:val="0"/>
+          <w:bCs w:val="0"/>
+          <w:color w:val="000000" w:themeColor="text1"/>
+          <w:sz w:val="19"/>
+          <w:szCs w:val="19"/>
+          <w:lang w:val="ru-US"/>
+        </w:rPr>
+        <w:t xml:space="preserve">        long double B = a.y - K * a.x;              // свободный член</w:t>
+      </w:r>
+    </w:p>
+    <w:p>
+      <w:pPr>
+        <w:pStyle w:val="1"/>
+        <w:jc w:val="left"/>
+        <w:rPr>
+          <w:rFonts w:ascii="JetBrains Mono" w:hAnsi="JetBrains Mono" w:cs="JetBrains Mono"/>
+          <w:b w:val="0"/>
+          <w:bCs w:val="0"/>
+          <w:color w:val="000000" w:themeColor="text1"/>
+          <w:sz w:val="19"/>
+          <w:szCs w:val="19"/>
+          <w:lang w:val="ru-US"/>
+        </w:rPr>
+      </w:pPr>
+    </w:p>
+    <w:p>
+      <w:pPr>
+        <w:pStyle w:val="1"/>
+        <w:jc w:val="left"/>
+        <w:rPr>
+          <w:rFonts w:ascii="JetBrains Mono" w:hAnsi="JetBrains Mono" w:cs="JetBrains Mono"/>
+          <w:b w:val="0"/>
+          <w:bCs w:val="0"/>
+          <w:color w:val="000000" w:themeColor="text1"/>
+          <w:sz w:val="19"/>
+          <w:szCs w:val="19"/>
+          <w:lang w:val="ru-US"/>
+        </w:rPr>
+      </w:pPr>
+      <w:r>
+        <w:rPr>
+          <w:rFonts w:ascii="JetBrains Mono" w:hAnsi="JetBrains Mono" w:cs="JetBrains Mono"/>
+          <w:b w:val="0"/>
+          <w:bCs w:val="0"/>
+          <w:color w:val="000000" w:themeColor="text1"/>
+          <w:sz w:val="19"/>
+          <w:szCs w:val="19"/>
+          <w:lang w:val="ru-US"/>
+        </w:rPr>
+        <w:t xml:space="preserve">        // Отклонение точки от прямой — разница между её фактической</w:t>
+      </w:r>
+    </w:p>
+    <w:p>
+      <w:pPr>
+        <w:pStyle w:val="1"/>
+        <w:jc w:val="left"/>
+        <w:rPr>
+          <w:rFonts w:ascii="JetBrains Mono" w:hAnsi="JetBrains Mono" w:cs="JetBrains Mono"/>
+          <w:b w:val="0"/>
+          <w:bCs w:val="0"/>
+          <w:color w:val="000000" w:themeColor="text1"/>
+          <w:sz w:val="19"/>
+          <w:szCs w:val="19"/>
+          <w:lang w:val="ru-US"/>
+        </w:rPr>
+      </w:pPr>
+      <w:r>
+        <w:rPr>
+          <w:rFonts w:ascii="JetBrains Mono" w:hAnsi="JetBrains Mono" w:cs="JetBrains Mono"/>
+          <w:b w:val="0"/>
+          <w:bCs w:val="0"/>
+          <w:color w:val="000000" w:themeColor="text1"/>
+          <w:sz w:val="19"/>
+          <w:szCs w:val="19"/>
+          <w:lang w:val="ru-US"/>
+        </w:rPr>
+        <w:t xml:space="preserve">        // координатой y и той, что даёт уравнение прямой при этом x.</w:t>
+      </w:r>
+    </w:p>
+    <w:p>
+      <w:pPr>
+        <w:pStyle w:val="1"/>
+        <w:jc w:val="left"/>
+        <w:rPr>
+          <w:rFonts w:ascii="JetBrains Mono" w:hAnsi="JetBrains Mono" w:cs="JetBrains Mono"/>
+          <w:b w:val="0"/>
+          <w:bCs w:val="0"/>
+          <w:color w:val="000000" w:themeColor="text1"/>
+          <w:sz w:val="19"/>
+          <w:szCs w:val="19"/>
+          <w:lang w:val="ru-US"/>
+        </w:rPr>
+      </w:pPr>
+      <w:r>
+        <w:rPr>
+          <w:rFonts w:ascii="JetBrains Mono" w:hAnsi="JetBrains Mono" w:cs="JetBrains Mono"/>
+          <w:b w:val="0"/>
+          <w:bCs w:val="0"/>
+          <w:color w:val="000000" w:themeColor="text1"/>
+          <w:sz w:val="19"/>
+          <w:szCs w:val="19"/>
+          <w:lang w:val="ru-US"/>
+        </w:rPr>
+        <w:t xml:space="preserve">        // Знак отклонения показывает, с какой стороны от прямой лежит точка.</w:t>
       </w:r>
     </w:p>
     <w:p>
@@ -1659,6 +2281,102 @@
           <w:lang w:val="ru-US"/>
         </w:rPr>
       </w:pPr>
+    </w:p>
+    <w:p>
+      <w:pPr>
+        <w:pStyle w:val="1"/>
+        <w:jc w:val="left"/>
+        <w:rPr>
+          <w:rFonts w:ascii="JetBrains Mono" w:hAnsi="JetBrains Mono" w:cs="JetBrains Mono"/>
+          <w:b w:val="0"/>
+          <w:bCs w:val="0"/>
+          <w:color w:val="000000" w:themeColor="text1"/>
+          <w:sz w:val="19"/>
+          <w:szCs w:val="19"/>
+          <w:lang w:val="ru-US"/>
+        </w:rPr>
+      </w:pPr>
+      <w:r>
+        <w:rPr>
+          <w:rFonts w:ascii="JetBrains Mono" w:hAnsi="JetBrains Mono" w:cs="JetBrains Mono"/>
+          <w:b w:val="0"/>
+          <w:bCs w:val="0"/>
+          <w:color w:val="000000" w:themeColor="text1"/>
+          <w:sz w:val="19"/>
+          <w:szCs w:val="19"/>
+          <w:lang w:val="ru-US"/>
+        </w:rPr>
+        <w:t xml:space="preserve">    // Если c и m лежат по одну сторону от прямой (одинаковый знак),</w:t>
+      </w:r>
+    </w:p>
+    <w:p>
+      <w:pPr>
+        <w:pStyle w:val="1"/>
+        <w:jc w:val="left"/>
+        <w:rPr>
+          <w:rFonts w:ascii="JetBrains Mono" w:hAnsi="JetBrains Mono" w:cs="JetBrains Mono"/>
+          <w:b w:val="0"/>
+          <w:bCs w:val="0"/>
+          <w:color w:val="000000" w:themeColor="text1"/>
+          <w:sz w:val="19"/>
+          <w:szCs w:val="19"/>
+          <w:lang w:val="ru-US"/>
+        </w:rPr>
+      </w:pPr>
+      <w:r>
+        <w:rPr>
+          <w:rFonts w:ascii="JetBrains Mono" w:hAnsi="JetBrains Mono" w:cs="JetBrains Mono"/>
+          <w:b w:val="0"/>
+          <w:bCs w:val="0"/>
+          <w:color w:val="000000" w:themeColor="text1"/>
+          <w:sz w:val="19"/>
+          <w:szCs w:val="19"/>
+          <w:lang w:val="ru-US"/>
+        </w:rPr>
+        <w:t xml:space="preserve">    // либо m лежит точно на прямой (deltaM == 0) — точка m допустима</w:t>
+      </w:r>
+    </w:p>
+    <w:p>
+      <w:pPr>
+        <w:pStyle w:val="1"/>
+        <w:jc w:val="left"/>
+        <w:rPr>
+          <w:rFonts w:ascii="JetBrains Mono" w:hAnsi="JetBrains Mono" w:cs="JetBrains Mono"/>
+          <w:b w:val="0"/>
+          <w:bCs w:val="0"/>
+          <w:color w:val="000000" w:themeColor="text1"/>
+          <w:sz w:val="19"/>
+          <w:szCs w:val="19"/>
+          <w:lang w:val="ru-US"/>
+        </w:rPr>
+      </w:pPr>
+      <w:r>
+        <w:rPr>
+          <w:rFonts w:ascii="JetBrains Mono" w:hAnsi="JetBrains Mono" w:cs="JetBrains Mono"/>
+          <w:b w:val="0"/>
+          <w:bCs w:val="0"/>
+          <w:color w:val="000000" w:themeColor="text1"/>
+          <w:sz w:val="19"/>
+          <w:szCs w:val="19"/>
+          <w:lang w:val="ru-US"/>
+        </w:rPr>
+        <w:t xml:space="preserve">    // относительно этой стороны треугольника.</w:t>
+      </w:r>
+    </w:p>
+    <w:p>
+      <w:pPr>
+        <w:pStyle w:val="1"/>
+        <w:jc w:val="left"/>
+        <w:rPr>
+          <w:rFonts w:ascii="JetBrains Mono" w:hAnsi="JetBrains Mono" w:cs="JetBrains Mono"/>
+          <w:b w:val="0"/>
+          <w:bCs w:val="0"/>
+          <w:color w:val="000000" w:themeColor="text1"/>
+          <w:sz w:val="19"/>
+          <w:szCs w:val="19"/>
+          <w:lang w:val="ru-US"/>
+        </w:rPr>
+      </w:pPr>
       <w:r>
         <w:rPr>
           <w:rFonts w:ascii="JetBrains Mono" w:hAnsi="JetBrains Mono" w:cs="JetBrains Mono"/>
@@ -1723,6 +2441,7 @@
           <w:szCs w:val="19"/>
           <w:lang w:val="ru-US"/>
         </w:rPr>
+        <w:lastRenderedPageBreak/>
         <w:t xml:space="preserve">    return 0;</w:t>
       </w:r>
     </w:p>
@@ -1767,6 +2486,129 @@
           <w:lang w:val="ru-US"/>
         </w:rPr>
       </w:pPr>
+    </w:p>
+    <w:p>
+      <w:pPr>
+        <w:pStyle w:val="1"/>
+        <w:jc w:val="left"/>
+        <w:rPr>
+          <w:rFonts w:ascii="JetBrains Mono" w:hAnsi="JetBrains Mono" w:cs="JetBrains Mono"/>
+          <w:b w:val="0"/>
+          <w:bCs w:val="0"/>
+          <w:color w:val="000000" w:themeColor="text1"/>
+          <w:sz w:val="19"/>
+          <w:szCs w:val="19"/>
+          <w:lang w:val="ru-US"/>
+        </w:rPr>
+      </w:pPr>
+      <w:r>
+        <w:rPr>
+          <w:rFonts w:ascii="JetBrains Mono" w:hAnsi="JetBrains Mono" w:cs="JetBrains Mono"/>
+          <w:b w:val="0"/>
+          <w:bCs w:val="0"/>
+          <w:color w:val="000000" w:themeColor="text1"/>
+          <w:sz w:val="19"/>
+          <w:szCs w:val="19"/>
+          <w:lang w:val="ru-US"/>
+        </w:rPr>
+        <w:t>// Проверяет, лежит ли точка p внутри треугольника triangle.</w:t>
+      </w:r>
+    </w:p>
+    <w:p>
+      <w:pPr>
+        <w:pStyle w:val="1"/>
+        <w:jc w:val="left"/>
+        <w:rPr>
+          <w:rFonts w:ascii="JetBrains Mono" w:hAnsi="JetBrains Mono" w:cs="JetBrains Mono"/>
+          <w:b w:val="0"/>
+          <w:bCs w:val="0"/>
+          <w:color w:val="000000" w:themeColor="text1"/>
+          <w:sz w:val="19"/>
+          <w:szCs w:val="19"/>
+          <w:lang w:val="ru-US"/>
+        </w:rPr>
+      </w:pPr>
+      <w:r>
+        <w:rPr>
+          <w:rFonts w:ascii="JetBrains Mono" w:hAnsi="JetBrains Mono" w:cs="JetBrains Mono"/>
+          <w:b w:val="0"/>
+          <w:bCs w:val="0"/>
+          <w:color w:val="000000" w:themeColor="text1"/>
+          <w:sz w:val="19"/>
+          <w:szCs w:val="19"/>
+          <w:lang w:val="ru-US"/>
+        </w:rPr>
+        <w:t>// Точка внутри треугольника тогда и только тогда, когда для каждой</w:t>
+      </w:r>
+    </w:p>
+    <w:p>
+      <w:pPr>
+        <w:pStyle w:val="1"/>
+        <w:jc w:val="left"/>
+        <w:rPr>
+          <w:rFonts w:ascii="JetBrains Mono" w:hAnsi="JetBrains Mono" w:cs="JetBrains Mono"/>
+          <w:b w:val="0"/>
+          <w:bCs w:val="0"/>
+          <w:color w:val="000000" w:themeColor="text1"/>
+          <w:sz w:val="19"/>
+          <w:szCs w:val="19"/>
+          <w:lang w:val="ru-US"/>
+        </w:rPr>
+      </w:pPr>
+      <w:r>
+        <w:rPr>
+          <w:rFonts w:ascii="JetBrains Mono" w:hAnsi="JetBrains Mono" w:cs="JetBrains Mono"/>
+          <w:b w:val="0"/>
+          <w:bCs w:val="0"/>
+          <w:color w:val="000000" w:themeColor="text1"/>
+          <w:sz w:val="19"/>
+          <w:szCs w:val="19"/>
+          <w:lang w:val="ru-US"/>
+        </w:rPr>
+        <w:t>// из трёх сторон точка p лежит с той же стороны, что и противоположная</w:t>
+      </w:r>
+    </w:p>
+    <w:p>
+      <w:pPr>
+        <w:pStyle w:val="1"/>
+        <w:jc w:val="left"/>
+        <w:rPr>
+          <w:rFonts w:ascii="JetBrains Mono" w:hAnsi="JetBrains Mono" w:cs="JetBrains Mono"/>
+          <w:b w:val="0"/>
+          <w:bCs w:val="0"/>
+          <w:color w:val="000000" w:themeColor="text1"/>
+          <w:sz w:val="19"/>
+          <w:szCs w:val="19"/>
+          <w:lang w:val="ru-US"/>
+        </w:rPr>
+      </w:pPr>
+      <w:r>
+        <w:rPr>
+          <w:rFonts w:ascii="JetBrains Mono" w:hAnsi="JetBrains Mono" w:cs="JetBrains Mono"/>
+          <w:b w:val="0"/>
+          <w:bCs w:val="0"/>
+          <w:color w:val="000000" w:themeColor="text1"/>
+          <w:sz w:val="19"/>
+          <w:szCs w:val="19"/>
+          <w:lang w:val="ru-US"/>
+        </w:rPr>
+        <w:t>// этой стороне вершина треугольника.</w:t>
+      </w:r>
+    </w:p>
+    <w:p>
+      <w:pPr>
+        <w:pStyle w:val="1"/>
+        <w:jc w:val="left"/>
+        <w:rPr>
+          <w:rFonts w:ascii="JetBrains Mono" w:hAnsi="JetBrains Mono" w:cs="JetBrains Mono"/>
+          <w:b w:val="0"/>
+          <w:bCs w:val="0"/>
+          <w:color w:val="000000" w:themeColor="text1"/>
+          <w:sz w:val="19"/>
+          <w:szCs w:val="19"/>
+          <w:lang w:val="ru-US"/>
+        </w:rPr>
+      </w:pPr>
       <w:r>
         <w:rPr>
           <w:rFonts w:ascii="JetBrains Mono" w:hAnsi="JetBrains Mono" w:cs="JetBrains Mono"/>
@@ -1804,401 +2646,815 @@
           <w:szCs w:val="19"/>
           <w:lang w:val="ru-US"/>
         </w:rPr>
+        <w:t xml:space="preserve">        if (valid(triangle[0],triangle[1], triangle[2], p) &amp;&amp;   // сторона (0,1), проверяем относительно вершины 2</w:t>
+      </w:r>
+    </w:p>
+    <w:p>
+      <w:pPr>
+        <w:pStyle w:val="1"/>
+        <w:jc w:val="left"/>
+        <w:rPr>
+          <w:rFonts w:ascii="JetBrains Mono" w:hAnsi="JetBrains Mono" w:cs="JetBrains Mono"/>
+          <w:b w:val="0"/>
+          <w:bCs w:val="0"/>
+          <w:color w:val="000000" w:themeColor="text1"/>
+          <w:sz w:val="19"/>
+          <w:szCs w:val="19"/>
+          <w:lang w:val="ru-US"/>
+        </w:rPr>
+      </w:pPr>
+      <w:r>
+        <w:rPr>
+          <w:rFonts w:ascii="JetBrains Mono" w:hAnsi="JetBrains Mono" w:cs="JetBrains Mono"/>
+          <w:b w:val="0"/>
+          <w:bCs w:val="0"/>
+          <w:color w:val="000000" w:themeColor="text1"/>
+          <w:sz w:val="19"/>
+          <w:szCs w:val="19"/>
+          <w:lang w:val="ru-US"/>
+        </w:rPr>
+        <w:t xml:space="preserve">            valid(triangle[1],triangle[2], triangle[0], p) &amp;&amp;   // сторона (1,2), проверяем относительно вершины 0</w:t>
+      </w:r>
+    </w:p>
+    <w:p>
+      <w:pPr>
+        <w:pStyle w:val="1"/>
+        <w:jc w:val="left"/>
+        <w:rPr>
+          <w:rFonts w:ascii="JetBrains Mono" w:hAnsi="JetBrains Mono" w:cs="JetBrains Mono"/>
+          <w:b w:val="0"/>
+          <w:bCs w:val="0"/>
+          <w:color w:val="000000" w:themeColor="text1"/>
+          <w:sz w:val="19"/>
+          <w:szCs w:val="19"/>
+          <w:lang w:val="ru-US"/>
+        </w:rPr>
+      </w:pPr>
+      <w:r>
+        <w:rPr>
+          <w:rFonts w:ascii="JetBrains Mono" w:hAnsi="JetBrains Mono" w:cs="JetBrains Mono"/>
+          <w:b w:val="0"/>
+          <w:bCs w:val="0"/>
+          <w:color w:val="000000" w:themeColor="text1"/>
+          <w:sz w:val="19"/>
+          <w:szCs w:val="19"/>
+          <w:lang w:val="ru-US"/>
+        </w:rPr>
+        <w:t xml:space="preserve">            valid(triangle[2],triangle[0], triangle[1], p)){    // сторона (2,0), проверяем относительно вершины 1</w:t>
+      </w:r>
+    </w:p>
+    <w:p>
+      <w:pPr>
+        <w:pStyle w:val="1"/>
+        <w:jc w:val="left"/>
+        <w:rPr>
+          <w:rFonts w:ascii="JetBrains Mono" w:hAnsi="JetBrains Mono" w:cs="JetBrains Mono"/>
+          <w:b w:val="0"/>
+          <w:bCs w:val="0"/>
+          <w:color w:val="000000" w:themeColor="text1"/>
+          <w:sz w:val="19"/>
+          <w:szCs w:val="19"/>
+          <w:lang w:val="ru-US"/>
+        </w:rPr>
+      </w:pPr>
+      <w:r>
+        <w:rPr>
+          <w:rFonts w:ascii="JetBrains Mono" w:hAnsi="JetBrains Mono" w:cs="JetBrains Mono"/>
+          <w:b w:val="0"/>
+          <w:bCs w:val="0"/>
+          <w:color w:val="000000" w:themeColor="text1"/>
+          <w:sz w:val="19"/>
+          <w:szCs w:val="19"/>
+          <w:lang w:val="ru-US"/>
+        </w:rPr>
+        <w:t xml:space="preserve">             std::cout&lt;&lt;"YES"&lt;&lt;std::endl;</w:t>
+      </w:r>
+    </w:p>
+    <w:p>
+      <w:pPr>
+        <w:pStyle w:val="1"/>
+        <w:jc w:val="left"/>
+        <w:rPr>
+          <w:rFonts w:ascii="JetBrains Mono" w:hAnsi="JetBrains Mono" w:cs="JetBrains Mono"/>
+          <w:b w:val="0"/>
+          <w:bCs w:val="0"/>
+          <w:color w:val="000000" w:themeColor="text1"/>
+          <w:sz w:val="19"/>
+          <w:szCs w:val="19"/>
+          <w:lang w:val="ru-US"/>
+        </w:rPr>
+      </w:pPr>
+      <w:r>
+        <w:rPr>
+          <w:rFonts w:ascii="JetBrains Mono" w:hAnsi="JetBrains Mono" w:cs="JetBrains Mono"/>
+          <w:b w:val="0"/>
+          <w:bCs w:val="0"/>
+          <w:color w:val="000000" w:themeColor="text1"/>
+          <w:sz w:val="19"/>
+          <w:szCs w:val="19"/>
+          <w:lang w:val="ru-US"/>
+        </w:rPr>
+        <w:t xml:space="preserve">            return 1;</w:t>
+      </w:r>
+    </w:p>
+    <w:p>
+      <w:pPr>
+        <w:pStyle w:val="1"/>
+        <w:jc w:val="left"/>
+        <w:rPr>
+          <w:rFonts w:ascii="JetBrains Mono" w:hAnsi="JetBrains Mono" w:cs="JetBrains Mono"/>
+          <w:b w:val="0"/>
+          <w:bCs w:val="0"/>
+          <w:color w:val="000000" w:themeColor="text1"/>
+          <w:sz w:val="19"/>
+          <w:szCs w:val="19"/>
+          <w:lang w:val="ru-US"/>
+        </w:rPr>
+      </w:pPr>
+      <w:r>
+        <w:rPr>
+          <w:rFonts w:ascii="JetBrains Mono" w:hAnsi="JetBrains Mono" w:cs="JetBrains Mono"/>
+          <w:b w:val="0"/>
+          <w:bCs w:val="0"/>
+          <w:color w:val="000000" w:themeColor="text1"/>
+          <w:sz w:val="19"/>
+          <w:szCs w:val="19"/>
+          <w:lang w:val="ru-US"/>
+        </w:rPr>
+        <w:t xml:space="preserve">        } else{</w:t>
+      </w:r>
+    </w:p>
+    <w:p>
+      <w:pPr>
+        <w:pStyle w:val="1"/>
+        <w:jc w:val="left"/>
+        <w:rPr>
+          <w:rFonts w:ascii="JetBrains Mono" w:hAnsi="JetBrains Mono" w:cs="JetBrains Mono"/>
+          <w:b w:val="0"/>
+          <w:bCs w:val="0"/>
+          <w:color w:val="000000" w:themeColor="text1"/>
+          <w:sz w:val="19"/>
+          <w:szCs w:val="19"/>
+          <w:lang w:val="ru-US"/>
+        </w:rPr>
+      </w:pPr>
+      <w:r>
+        <w:rPr>
+          <w:rFonts w:ascii="JetBrains Mono" w:hAnsi="JetBrains Mono" w:cs="JetBrains Mono"/>
+          <w:b w:val="0"/>
+          <w:bCs w:val="0"/>
+          <w:color w:val="000000" w:themeColor="text1"/>
+          <w:sz w:val="19"/>
+          <w:szCs w:val="19"/>
+          <w:lang w:val="ru-US"/>
+        </w:rPr>
+        <w:t xml:space="preserve">             std::cout&lt;&lt;"NO"&lt;&lt; std::endl;</w:t>
+      </w:r>
+    </w:p>
+    <w:p>
+      <w:pPr>
+        <w:pStyle w:val="1"/>
+        <w:jc w:val="left"/>
+        <w:rPr>
+          <w:rFonts w:ascii="JetBrains Mono" w:hAnsi="JetBrains Mono" w:cs="JetBrains Mono"/>
+          <w:b w:val="0"/>
+          <w:bCs w:val="0"/>
+          <w:color w:val="000000" w:themeColor="text1"/>
+          <w:sz w:val="19"/>
+          <w:szCs w:val="19"/>
+          <w:lang w:val="ru-US"/>
+        </w:rPr>
+      </w:pPr>
+      <w:r>
+        <w:rPr>
+          <w:rFonts w:ascii="JetBrains Mono" w:hAnsi="JetBrains Mono" w:cs="JetBrains Mono"/>
+          <w:b w:val="0"/>
+          <w:bCs w:val="0"/>
+          <w:color w:val="000000" w:themeColor="text1"/>
+          <w:sz w:val="19"/>
+          <w:szCs w:val="19"/>
+          <w:lang w:val="ru-US"/>
+        </w:rPr>
+        <w:t xml:space="preserve">            return 0;</w:t>
+      </w:r>
+    </w:p>
+    <w:p>
+      <w:pPr>
+        <w:pStyle w:val="1"/>
+        <w:jc w:val="left"/>
+        <w:rPr>
+          <w:rFonts w:ascii="JetBrains Mono" w:hAnsi="JetBrains Mono" w:cs="JetBrains Mono"/>
+          <w:b w:val="0"/>
+          <w:bCs w:val="0"/>
+          <w:color w:val="000000" w:themeColor="text1"/>
+          <w:sz w:val="19"/>
+          <w:szCs w:val="19"/>
+          <w:lang w:val="ru-US"/>
+        </w:rPr>
+      </w:pPr>
+      <w:r>
+        <w:rPr>
+          <w:rFonts w:ascii="JetBrains Mono" w:hAnsi="JetBrains Mono" w:cs="JetBrains Mono"/>
+          <w:b w:val="0"/>
+          <w:bCs w:val="0"/>
+          <w:color w:val="000000" w:themeColor="text1"/>
+          <w:sz w:val="19"/>
+          <w:szCs w:val="19"/>
+          <w:lang w:val="ru-US"/>
+        </w:rPr>
+        <w:t xml:space="preserve">        }</w:t>
+      </w:r>
+    </w:p>
+    <w:p>
+      <w:pPr>
+        <w:pStyle w:val="1"/>
+        <w:jc w:val="left"/>
+        <w:rPr>
+          <w:rFonts w:ascii="JetBrains Mono" w:hAnsi="JetBrains Mono" w:cs="JetBrains Mono"/>
+          <w:b w:val="0"/>
+          <w:bCs w:val="0"/>
+          <w:color w:val="000000" w:themeColor="text1"/>
+          <w:sz w:val="19"/>
+          <w:szCs w:val="19"/>
+          <w:lang w:val="ru-US"/>
+        </w:rPr>
+      </w:pPr>
+      <w:r>
+        <w:rPr>
+          <w:rFonts w:ascii="JetBrains Mono" w:hAnsi="JetBrains Mono" w:cs="JetBrains Mono"/>
+          <w:b w:val="0"/>
+          <w:bCs w:val="0"/>
+          <w:color w:val="000000" w:themeColor="text1"/>
+          <w:sz w:val="19"/>
+          <w:szCs w:val="19"/>
+          <w:lang w:val="ru-US"/>
+        </w:rPr>
+        <w:t>}</w:t>
+      </w:r>
+    </w:p>
+    <w:p>
+      <w:pPr>
+        <w:pStyle w:val="1"/>
+        <w:jc w:val="left"/>
+        <w:rPr>
+          <w:rFonts w:ascii="JetBrains Mono" w:hAnsi="JetBrains Mono" w:cs="JetBrains Mono"/>
+          <w:b w:val="0"/>
+          <w:bCs w:val="0"/>
+          <w:color w:val="000000" w:themeColor="text1"/>
+          <w:sz w:val="19"/>
+          <w:szCs w:val="19"/>
+          <w:lang w:val="ru-US"/>
+        </w:rPr>
+      </w:pPr>
+    </w:p>
+    <w:p>
+      <w:pPr>
+        <w:pStyle w:val="1"/>
+        <w:jc w:val="left"/>
+        <w:rPr>
+          <w:rFonts w:ascii="JetBrains Mono" w:hAnsi="JetBrains Mono" w:cs="JetBrains Mono"/>
+          <w:b w:val="0"/>
+          <w:bCs w:val="0"/>
+          <w:color w:val="000000" w:themeColor="text1"/>
+          <w:sz w:val="19"/>
+          <w:szCs w:val="19"/>
+          <w:lang w:val="ru-US"/>
+        </w:rPr>
+      </w:pPr>
+      <w:r>
+        <w:rPr>
+          <w:rFonts w:ascii="JetBrains Mono" w:hAnsi="JetBrains Mono" w:cs="JetBrains Mono"/>
+          <w:b w:val="0"/>
+          <w:bCs w:val="0"/>
+          <w:color w:val="000000" w:themeColor="text1"/>
+          <w:sz w:val="19"/>
+          <w:szCs w:val="19"/>
+          <w:lang w:val="ru-US"/>
+        </w:rPr>
+        <w:t>int main(){</w:t>
+      </w:r>
+    </w:p>
+    <w:p>
+      <w:pPr>
+        <w:pStyle w:val="1"/>
+        <w:jc w:val="left"/>
+        <w:rPr>
+          <w:rFonts w:ascii="JetBrains Mono" w:hAnsi="JetBrains Mono" w:cs="JetBrains Mono"/>
+          <w:b w:val="0"/>
+          <w:bCs w:val="0"/>
+          <w:color w:val="000000" w:themeColor="text1"/>
+          <w:sz w:val="19"/>
+          <w:szCs w:val="19"/>
+          <w:lang w:val="ru-US"/>
+        </w:rPr>
+      </w:pPr>
+      <w:r>
+        <w:rPr>
+          <w:rFonts w:ascii="JetBrains Mono" w:hAnsi="JetBrains Mono" w:cs="JetBrains Mono"/>
+          <w:b w:val="0"/>
+          <w:bCs w:val="0"/>
+          <w:color w:val="000000" w:themeColor="text1"/>
+          <w:sz w:val="19"/>
+          <w:szCs w:val="19"/>
+          <w:lang w:val="ru-US"/>
+        </w:rPr>
+        <w:t xml:space="preserve">    long double x,y;</w:t>
+      </w:r>
+    </w:p>
+    <w:p>
+      <w:pPr>
+        <w:pStyle w:val="1"/>
+        <w:jc w:val="left"/>
+        <w:rPr>
+          <w:rFonts w:ascii="JetBrains Mono" w:hAnsi="JetBrains Mono" w:cs="JetBrains Mono"/>
+          <w:b w:val="0"/>
+          <w:bCs w:val="0"/>
+          <w:color w:val="000000" w:themeColor="text1"/>
+          <w:sz w:val="19"/>
+          <w:szCs w:val="19"/>
+          <w:lang w:val="ru-US"/>
+        </w:rPr>
+      </w:pPr>
+    </w:p>
+    <w:p>
+      <w:pPr>
+        <w:pStyle w:val="1"/>
+        <w:jc w:val="left"/>
+        <w:rPr>
+          <w:rFonts w:ascii="JetBrains Mono" w:hAnsi="JetBrains Mono" w:cs="JetBrains Mono"/>
+          <w:b w:val="0"/>
+          <w:bCs w:val="0"/>
+          <w:color w:val="000000" w:themeColor="text1"/>
+          <w:sz w:val="19"/>
+          <w:szCs w:val="19"/>
+          <w:lang w:val="ru-US"/>
+        </w:rPr>
+      </w:pPr>
+      <w:r>
+        <w:rPr>
+          <w:rFonts w:ascii="JetBrains Mono" w:hAnsi="JetBrains Mono" w:cs="JetBrains Mono"/>
+          <w:b w:val="0"/>
+          <w:bCs w:val="0"/>
+          <w:color w:val="000000" w:themeColor="text1"/>
+          <w:sz w:val="19"/>
+          <w:szCs w:val="19"/>
+          <w:lang w:val="ru-US"/>
+        </w:rPr>
+        <w:t xml:space="preserve">    // Треугольник хранится как вектор из 3 вершин (изначально нулевые).</w:t>
+      </w:r>
+    </w:p>
+    <w:p>
+      <w:pPr>
+        <w:pStyle w:val="1"/>
+        <w:jc w:val="left"/>
+        <w:rPr>
+          <w:rFonts w:ascii="JetBrains Mono" w:hAnsi="JetBrains Mono" w:cs="JetBrains Mono"/>
+          <w:b w:val="0"/>
+          <w:bCs w:val="0"/>
+          <w:color w:val="000000" w:themeColor="text1"/>
+          <w:sz w:val="19"/>
+          <w:szCs w:val="19"/>
+          <w:lang w:val="ru-US"/>
+        </w:rPr>
+      </w:pPr>
+      <w:r>
+        <w:rPr>
+          <w:rFonts w:ascii="JetBrains Mono" w:hAnsi="JetBrains Mono" w:cs="JetBrains Mono"/>
+          <w:b w:val="0"/>
+          <w:bCs w:val="0"/>
+          <w:color w:val="000000" w:themeColor="text1"/>
+          <w:sz w:val="19"/>
+          <w:szCs w:val="19"/>
+          <w:lang w:val="ru-US"/>
+        </w:rPr>
+        <w:t xml:space="preserve">    std::vector&lt;Point&gt; tr = {Point(0,0), Point(0,0), Point(0,0)};</w:t>
+      </w:r>
+    </w:p>
+    <w:p>
+      <w:pPr>
+        <w:pStyle w:val="1"/>
+        <w:jc w:val="left"/>
+        <w:rPr>
+          <w:rFonts w:ascii="JetBrains Mono" w:hAnsi="JetBrains Mono" w:cs="JetBrains Mono"/>
+          <w:b w:val="0"/>
+          <w:bCs w:val="0"/>
+          <w:color w:val="000000" w:themeColor="text1"/>
+          <w:sz w:val="19"/>
+          <w:szCs w:val="19"/>
+          <w:lang w:val="ru-US"/>
+        </w:rPr>
+      </w:pPr>
+    </w:p>
+    <w:p>
+      <w:pPr>
+        <w:pStyle w:val="1"/>
+        <w:jc w:val="left"/>
+        <w:rPr>
+          <w:rFonts w:ascii="JetBrains Mono" w:hAnsi="JetBrains Mono" w:cs="JetBrains Mono"/>
+          <w:b w:val="0"/>
+          <w:bCs w:val="0"/>
+          <w:color w:val="000000" w:themeColor="text1"/>
+          <w:sz w:val="19"/>
+          <w:szCs w:val="19"/>
+          <w:lang w:val="ru-US"/>
+        </w:rPr>
+      </w:pPr>
+      <w:r>
+        <w:rPr>
+          <w:rFonts w:ascii="JetBrains Mono" w:hAnsi="JetBrains Mono" w:cs="JetBrains Mono"/>
+          <w:b w:val="0"/>
+          <w:bCs w:val="0"/>
+          <w:color w:val="000000" w:themeColor="text1"/>
+          <w:sz w:val="19"/>
+          <w:szCs w:val="19"/>
+          <w:lang w:val="ru-US"/>
+        </w:rPr>
+        <w:t xml:space="preserve">    // Ввод координат треугольника (предполагается корректный ввод,</w:t>
+      </w:r>
+    </w:p>
+    <w:p>
+      <w:pPr>
+        <w:pStyle w:val="1"/>
+        <w:jc w:val="left"/>
+        <w:rPr>
+          <w:rFonts w:ascii="JetBrains Mono" w:hAnsi="JetBrains Mono" w:cs="JetBrains Mono"/>
+          <w:b w:val="0"/>
+          <w:bCs w:val="0"/>
+          <w:color w:val="000000" w:themeColor="text1"/>
+          <w:sz w:val="19"/>
+          <w:szCs w:val="19"/>
+          <w:lang w:val="ru-US"/>
+        </w:rPr>
+      </w:pPr>
+      <w:r>
+        <w:rPr>
+          <w:rFonts w:ascii="JetBrains Mono" w:hAnsi="JetBrains Mono" w:cs="JetBrains Mono"/>
+          <w:b w:val="0"/>
+          <w:bCs w:val="0"/>
+          <w:color w:val="000000" w:themeColor="text1"/>
+          <w:sz w:val="19"/>
+          <w:szCs w:val="19"/>
+          <w:lang w:val="ru-US"/>
+        </w:rPr>
         <w:lastRenderedPageBreak/>
-        <w:t xml:space="preserve">    // Point p;</w:t>
-      </w:r>
-    </w:p>
-    <w:p>
-      <w:pPr>
-        <w:pStyle w:val="1"/>
-        <w:jc w:val="left"/>
-        <w:rPr>
-          <w:rFonts w:ascii="JetBrains Mono" w:hAnsi="JetBrains Mono" w:cs="JetBrains Mono"/>
-          <w:b w:val="0"/>
-          <w:bCs w:val="0"/>
-          <w:color w:val="000000" w:themeColor="text1"/>
-          <w:sz w:val="19"/>
-          <w:szCs w:val="19"/>
-          <w:lang w:val="ru-US"/>
-        </w:rPr>
-      </w:pPr>
-      <w:r>
-        <w:rPr>
-          <w:rFonts w:ascii="JetBrains Mono" w:hAnsi="JetBrains Mono" w:cs="JetBrains Mono"/>
-          <w:b w:val="0"/>
-          <w:bCs w:val="0"/>
-          <w:color w:val="000000" w:themeColor="text1"/>
-          <w:sz w:val="19"/>
-          <w:szCs w:val="19"/>
-          <w:lang w:val="ru-US"/>
-        </w:rPr>
-        <w:t xml:space="preserve">    // std::cin&gt;&gt;p.x &gt;&gt; p.y;</w:t>
-      </w:r>
-    </w:p>
-    <w:p>
-      <w:pPr>
-        <w:pStyle w:val="1"/>
-        <w:jc w:val="left"/>
-        <w:rPr>
-          <w:rFonts w:ascii="JetBrains Mono" w:hAnsi="JetBrains Mono" w:cs="JetBrains Mono"/>
-          <w:b w:val="0"/>
-          <w:bCs w:val="0"/>
-          <w:color w:val="000000" w:themeColor="text1"/>
-          <w:sz w:val="19"/>
-          <w:szCs w:val="19"/>
-          <w:lang w:val="ru-US"/>
-        </w:rPr>
-      </w:pPr>
-      <w:r>
-        <w:rPr>
-          <w:rFonts w:ascii="JetBrains Mono" w:hAnsi="JetBrains Mono" w:cs="JetBrains Mono"/>
-          <w:b w:val="0"/>
-          <w:bCs w:val="0"/>
-          <w:color w:val="000000" w:themeColor="text1"/>
-          <w:sz w:val="19"/>
-          <w:szCs w:val="19"/>
-          <w:lang w:val="ru-US"/>
-        </w:rPr>
-        <w:t xml:space="preserve">    //while (!(p.x == 0.0 &amp;&amp; p.y == 0.0)){</w:t>
-      </w:r>
-    </w:p>
-    <w:p>
-      <w:pPr>
-        <w:pStyle w:val="1"/>
-        <w:jc w:val="left"/>
-        <w:rPr>
-          <w:rFonts w:ascii="JetBrains Mono" w:hAnsi="JetBrains Mono" w:cs="JetBrains Mono"/>
-          <w:b w:val="0"/>
-          <w:bCs w:val="0"/>
-          <w:color w:val="000000" w:themeColor="text1"/>
-          <w:sz w:val="19"/>
-          <w:szCs w:val="19"/>
-          <w:lang w:val="ru-US"/>
-        </w:rPr>
-      </w:pPr>
-      <w:r>
-        <w:rPr>
-          <w:rFonts w:ascii="JetBrains Mono" w:hAnsi="JetBrains Mono" w:cs="JetBrains Mono"/>
-          <w:b w:val="0"/>
-          <w:bCs w:val="0"/>
-          <w:color w:val="000000" w:themeColor="text1"/>
-          <w:sz w:val="19"/>
-          <w:szCs w:val="19"/>
-          <w:lang w:val="ru-US"/>
-        </w:rPr>
-        <w:t xml:space="preserve">        // for (size_t i = 0; i &lt; triangle.size(); i++){</w:t>
-      </w:r>
-    </w:p>
-    <w:p>
-      <w:pPr>
-        <w:pStyle w:val="1"/>
-        <w:jc w:val="left"/>
-        <w:rPr>
-          <w:rFonts w:ascii="JetBrains Mono" w:hAnsi="JetBrains Mono" w:cs="JetBrains Mono"/>
-          <w:b w:val="0"/>
-          <w:bCs w:val="0"/>
-          <w:color w:val="000000" w:themeColor="text1"/>
-          <w:sz w:val="19"/>
-          <w:szCs w:val="19"/>
-          <w:lang w:val="ru-US"/>
-        </w:rPr>
-      </w:pPr>
-      <w:r>
-        <w:rPr>
-          <w:rFonts w:ascii="JetBrains Mono" w:hAnsi="JetBrains Mono" w:cs="JetBrains Mono"/>
-          <w:b w:val="0"/>
-          <w:bCs w:val="0"/>
-          <w:color w:val="000000" w:themeColor="text1"/>
-          <w:sz w:val="19"/>
-          <w:szCs w:val="19"/>
-          <w:lang w:val="ru-US"/>
-        </w:rPr>
-        <w:t xml:space="preserve">        //     std::cin&gt;&gt;triangle[i].x &gt;&gt; triangle[i].y;</w:t>
-      </w:r>
-    </w:p>
-    <w:p>
-      <w:pPr>
-        <w:pStyle w:val="1"/>
-        <w:jc w:val="left"/>
-        <w:rPr>
-          <w:rFonts w:ascii="JetBrains Mono" w:hAnsi="JetBrains Mono" w:cs="JetBrains Mono"/>
-          <w:b w:val="0"/>
-          <w:bCs w:val="0"/>
-          <w:color w:val="000000" w:themeColor="text1"/>
-          <w:sz w:val="19"/>
-          <w:szCs w:val="19"/>
-          <w:lang w:val="ru-US"/>
-        </w:rPr>
-      </w:pPr>
-      <w:r>
-        <w:rPr>
-          <w:rFonts w:ascii="JetBrains Mono" w:hAnsi="JetBrains Mono" w:cs="JetBrains Mono"/>
-          <w:b w:val="0"/>
-          <w:bCs w:val="0"/>
-          <w:color w:val="000000" w:themeColor="text1"/>
-          <w:sz w:val="19"/>
-          <w:szCs w:val="19"/>
-          <w:lang w:val="ru-US"/>
-        </w:rPr>
-        <w:t xml:space="preserve">        // }</w:t>
-      </w:r>
-    </w:p>
-    <w:p>
-      <w:pPr>
-        <w:pStyle w:val="1"/>
-        <w:jc w:val="left"/>
-        <w:rPr>
-          <w:rFonts w:ascii="JetBrains Mono" w:hAnsi="JetBrains Mono" w:cs="JetBrains Mono"/>
-          <w:b w:val="0"/>
-          <w:bCs w:val="0"/>
-          <w:color w:val="000000" w:themeColor="text1"/>
-          <w:sz w:val="19"/>
-          <w:szCs w:val="19"/>
-          <w:lang w:val="ru-US"/>
-        </w:rPr>
-      </w:pPr>
-      <w:r>
-        <w:rPr>
-          <w:rFonts w:ascii="JetBrains Mono" w:hAnsi="JetBrains Mono" w:cs="JetBrains Mono"/>
-          <w:b w:val="0"/>
-          <w:bCs w:val="0"/>
-          <w:color w:val="000000" w:themeColor="text1"/>
-          <w:sz w:val="19"/>
-          <w:szCs w:val="19"/>
-          <w:lang w:val="ru-US"/>
-        </w:rPr>
-        <w:t xml:space="preserve">        if (valid(triangle[0],triangle[1], triangle[2], p) &amp;&amp; valid(triangle[1],triangle[2], triangle[0], p) &amp;&amp; valid(triangle[2],triangle[0], triangle[1], p)){</w:t>
-      </w:r>
-    </w:p>
-    <w:p>
-      <w:pPr>
-        <w:pStyle w:val="1"/>
-        <w:jc w:val="left"/>
-        <w:rPr>
-          <w:rFonts w:ascii="JetBrains Mono" w:hAnsi="JetBrains Mono" w:cs="JetBrains Mono"/>
-          <w:b w:val="0"/>
-          <w:bCs w:val="0"/>
-          <w:color w:val="000000" w:themeColor="text1"/>
-          <w:sz w:val="19"/>
-          <w:szCs w:val="19"/>
-          <w:lang w:val="ru-US"/>
-        </w:rPr>
-      </w:pPr>
-      <w:r>
-        <w:rPr>
-          <w:rFonts w:ascii="JetBrains Mono" w:hAnsi="JetBrains Mono" w:cs="JetBrains Mono"/>
-          <w:b w:val="0"/>
-          <w:bCs w:val="0"/>
-          <w:color w:val="000000" w:themeColor="text1"/>
-          <w:sz w:val="19"/>
-          <w:szCs w:val="19"/>
-          <w:lang w:val="ru-US"/>
-        </w:rPr>
-        <w:t xml:space="preserve">            // std::cout&lt;&lt;"YES"&lt;&lt;std::endl;</w:t>
-      </w:r>
-    </w:p>
-    <w:p>
-      <w:pPr>
-        <w:pStyle w:val="1"/>
-        <w:jc w:val="left"/>
-        <w:rPr>
-          <w:rFonts w:ascii="JetBrains Mono" w:hAnsi="JetBrains Mono" w:cs="JetBrains Mono"/>
-          <w:b w:val="0"/>
-          <w:bCs w:val="0"/>
-          <w:color w:val="000000" w:themeColor="text1"/>
-          <w:sz w:val="19"/>
-          <w:szCs w:val="19"/>
-          <w:lang w:val="ru-US"/>
-        </w:rPr>
-      </w:pPr>
-      <w:r>
-        <w:rPr>
-          <w:rFonts w:ascii="JetBrains Mono" w:hAnsi="JetBrains Mono" w:cs="JetBrains Mono"/>
-          <w:b w:val="0"/>
-          <w:bCs w:val="0"/>
-          <w:color w:val="000000" w:themeColor="text1"/>
-          <w:sz w:val="19"/>
-          <w:szCs w:val="19"/>
-          <w:lang w:val="ru-US"/>
-        </w:rPr>
-        <w:t xml:space="preserve">            return 1;</w:t>
-      </w:r>
-    </w:p>
-    <w:p>
-      <w:pPr>
-        <w:pStyle w:val="1"/>
-        <w:jc w:val="left"/>
-        <w:rPr>
-          <w:rFonts w:ascii="JetBrains Mono" w:hAnsi="JetBrains Mono" w:cs="JetBrains Mono"/>
-          <w:b w:val="0"/>
-          <w:bCs w:val="0"/>
-          <w:color w:val="000000" w:themeColor="text1"/>
-          <w:sz w:val="19"/>
-          <w:szCs w:val="19"/>
-          <w:lang w:val="ru-US"/>
-        </w:rPr>
-      </w:pPr>
-      <w:r>
-        <w:rPr>
-          <w:rFonts w:ascii="JetBrains Mono" w:hAnsi="JetBrains Mono" w:cs="JetBrains Mono"/>
-          <w:b w:val="0"/>
-          <w:bCs w:val="0"/>
-          <w:color w:val="000000" w:themeColor="text1"/>
-          <w:sz w:val="19"/>
-          <w:szCs w:val="19"/>
-          <w:lang w:val="ru-US"/>
-        </w:rPr>
-        <w:t xml:space="preserve">        } else{</w:t>
-      </w:r>
-    </w:p>
-    <w:p>
-      <w:pPr>
-        <w:pStyle w:val="1"/>
-        <w:jc w:val="left"/>
-        <w:rPr>
-          <w:rFonts w:ascii="JetBrains Mono" w:hAnsi="JetBrains Mono" w:cs="JetBrains Mono"/>
-          <w:b w:val="0"/>
-          <w:bCs w:val="0"/>
-          <w:color w:val="000000" w:themeColor="text1"/>
-          <w:sz w:val="19"/>
-          <w:szCs w:val="19"/>
-          <w:lang w:val="ru-US"/>
-        </w:rPr>
-      </w:pPr>
-      <w:r>
-        <w:rPr>
-          <w:rFonts w:ascii="JetBrains Mono" w:hAnsi="JetBrains Mono" w:cs="JetBrains Mono"/>
-          <w:b w:val="0"/>
-          <w:bCs w:val="0"/>
-          <w:color w:val="000000" w:themeColor="text1"/>
-          <w:sz w:val="19"/>
-          <w:szCs w:val="19"/>
-          <w:lang w:val="ru-US"/>
-        </w:rPr>
-        <w:t xml:space="preserve">            // std::cout&lt;&lt;"NO"&lt;&lt; std::endl;</w:t>
-      </w:r>
-    </w:p>
-    <w:p>
-      <w:pPr>
-        <w:pStyle w:val="1"/>
-        <w:jc w:val="left"/>
-        <w:rPr>
-          <w:rFonts w:ascii="JetBrains Mono" w:hAnsi="JetBrains Mono" w:cs="JetBrains Mono"/>
-          <w:b w:val="0"/>
-          <w:bCs w:val="0"/>
-          <w:color w:val="000000" w:themeColor="text1"/>
-          <w:sz w:val="19"/>
-          <w:szCs w:val="19"/>
-          <w:lang w:val="ru-US"/>
-        </w:rPr>
-      </w:pPr>
-      <w:r>
-        <w:rPr>
-          <w:rFonts w:ascii="JetBrains Mono" w:hAnsi="JetBrains Mono" w:cs="JetBrains Mono"/>
-          <w:b w:val="0"/>
-          <w:bCs w:val="0"/>
-          <w:color w:val="000000" w:themeColor="text1"/>
-          <w:sz w:val="19"/>
-          <w:szCs w:val="19"/>
-          <w:lang w:val="ru-US"/>
-        </w:rPr>
-        <w:t xml:space="preserve">            return 0;</w:t>
-      </w:r>
-    </w:p>
-    <w:p>
-      <w:pPr>
-        <w:pStyle w:val="1"/>
-        <w:jc w:val="left"/>
-        <w:rPr>
-          <w:rFonts w:ascii="JetBrains Mono" w:hAnsi="JetBrains Mono" w:cs="JetBrains Mono"/>
-          <w:b w:val="0"/>
-          <w:bCs w:val="0"/>
-          <w:color w:val="000000" w:themeColor="text1"/>
-          <w:sz w:val="19"/>
-          <w:szCs w:val="19"/>
-          <w:lang w:val="ru-US"/>
-        </w:rPr>
-      </w:pPr>
-      <w:r>
-        <w:rPr>
-          <w:rFonts w:ascii="JetBrains Mono" w:hAnsi="JetBrains Mono" w:cs="JetBrains Mono"/>
-          <w:b w:val="0"/>
-          <w:bCs w:val="0"/>
-          <w:color w:val="000000" w:themeColor="text1"/>
-          <w:sz w:val="19"/>
-          <w:szCs w:val="19"/>
-          <w:lang w:val="ru-US"/>
-        </w:rPr>
-        <w:t xml:space="preserve">        }</w:t>
-      </w:r>
-    </w:p>
-    <w:p>
-      <w:pPr>
-        <w:pStyle w:val="1"/>
-        <w:jc w:val="left"/>
-        <w:rPr>
-          <w:rFonts w:ascii="JetBrains Mono" w:hAnsi="JetBrains Mono" w:cs="JetBrains Mono"/>
-          <w:b w:val="0"/>
-          <w:bCs w:val="0"/>
-          <w:color w:val="000000" w:themeColor="text1"/>
-          <w:sz w:val="19"/>
-          <w:szCs w:val="19"/>
-          <w:lang w:val="ru-US"/>
-        </w:rPr>
-      </w:pPr>
-      <w:r>
-        <w:rPr>
-          <w:rFonts w:ascii="JetBrains Mono" w:hAnsi="JetBrains Mono" w:cs="JetBrains Mono"/>
-          <w:b w:val="0"/>
-          <w:bCs w:val="0"/>
-          <w:color w:val="000000" w:themeColor="text1"/>
-          <w:sz w:val="19"/>
-          <w:szCs w:val="19"/>
-          <w:lang w:val="ru-US"/>
-        </w:rPr>
-        <w:t xml:space="preserve">        //std::cin&gt;&gt;p.x &gt;&gt; p.y;   </w:t>
-      </w:r>
-    </w:p>
-    <w:p>
-      <w:pPr>
-        <w:pStyle w:val="1"/>
-        <w:jc w:val="left"/>
-        <w:rPr>
-          <w:rFonts w:ascii="JetBrains Mono" w:hAnsi="JetBrains Mono" w:cs="JetBrains Mono"/>
-          <w:b w:val="0"/>
-          <w:bCs w:val="0"/>
-          <w:color w:val="000000" w:themeColor="text1"/>
-          <w:sz w:val="19"/>
-          <w:szCs w:val="19"/>
-          <w:lang w:val="ru-US"/>
-        </w:rPr>
-      </w:pPr>
-      <w:r>
-        <w:rPr>
-          <w:rFonts w:ascii="JetBrains Mono" w:hAnsi="JetBrains Mono" w:cs="JetBrains Mono"/>
-          <w:b w:val="0"/>
-          <w:bCs w:val="0"/>
-          <w:color w:val="000000" w:themeColor="text1"/>
-          <w:sz w:val="19"/>
-          <w:szCs w:val="19"/>
-          <w:lang w:val="ru-US"/>
-        </w:rPr>
-        <w:t xml:space="preserve">    //}</w:t>
-      </w:r>
-    </w:p>
-    <w:p>
-      <w:pPr>
-        <w:pStyle w:val="1"/>
-        <w:jc w:val="left"/>
-        <w:rPr>
-          <w:rFonts w:ascii="JetBrains Mono" w:hAnsi="JetBrains Mono" w:cs="JetBrains Mono"/>
-          <w:b w:val="0"/>
-          <w:bCs w:val="0"/>
-          <w:color w:val="000000" w:themeColor="text1"/>
-          <w:sz w:val="19"/>
-          <w:szCs w:val="19"/>
-          <w:lang w:val="ru-US"/>
-        </w:rPr>
+        <w:t xml:space="preserve">    // т.е. заранее известно, что три точки действительно образуют треугольник).</w:t>
+      </w:r>
+    </w:p>
+    <w:p>
+      <w:pPr>
+        <w:pStyle w:val="1"/>
+        <w:jc w:val="left"/>
+        <w:rPr>
+          <w:rFonts w:ascii="JetBrains Mono" w:hAnsi="JetBrains Mono" w:cs="JetBrains Mono"/>
+          <w:b w:val="0"/>
+          <w:bCs w:val="0"/>
+          <w:color w:val="000000" w:themeColor="text1"/>
+          <w:sz w:val="19"/>
+          <w:szCs w:val="19"/>
+          <w:lang w:val="ru-US"/>
+        </w:rPr>
+      </w:pPr>
+      <w:r>
+        <w:rPr>
+          <w:rFonts w:ascii="JetBrains Mono" w:hAnsi="JetBrains Mono" w:cs="JetBrains Mono"/>
+          <w:b w:val="0"/>
+          <w:bCs w:val="0"/>
+          <w:color w:val="000000" w:themeColor="text1"/>
+          <w:sz w:val="19"/>
+          <w:szCs w:val="19"/>
+          <w:lang w:val="ru-US"/>
+        </w:rPr>
+        <w:t xml:space="preserve">    for (size_t i = 0; i &lt; 3; i++)</w:t>
+      </w:r>
+    </w:p>
+    <w:p>
+      <w:pPr>
+        <w:pStyle w:val="1"/>
+        <w:jc w:val="left"/>
+        <w:rPr>
+          <w:rFonts w:ascii="JetBrains Mono" w:hAnsi="JetBrains Mono" w:cs="JetBrains Mono"/>
+          <w:b w:val="0"/>
+          <w:bCs w:val="0"/>
+          <w:color w:val="000000" w:themeColor="text1"/>
+          <w:sz w:val="19"/>
+          <w:szCs w:val="19"/>
+          <w:lang w:val="ru-US"/>
+        </w:rPr>
+      </w:pPr>
+      <w:r>
+        <w:rPr>
+          <w:rFonts w:ascii="JetBrains Mono" w:hAnsi="JetBrains Mono" w:cs="JetBrains Mono"/>
+          <w:b w:val="0"/>
+          <w:bCs w:val="0"/>
+          <w:color w:val="000000" w:themeColor="text1"/>
+          <w:sz w:val="19"/>
+          <w:szCs w:val="19"/>
+          <w:lang w:val="ru-US"/>
+        </w:rPr>
+        <w:t xml:space="preserve">    {</w:t>
+      </w:r>
+    </w:p>
+    <w:p>
+      <w:pPr>
+        <w:pStyle w:val="1"/>
+        <w:jc w:val="left"/>
+        <w:rPr>
+          <w:rFonts w:ascii="JetBrains Mono" w:hAnsi="JetBrains Mono" w:cs="JetBrains Mono"/>
+          <w:b w:val="0"/>
+          <w:bCs w:val="0"/>
+          <w:color w:val="000000" w:themeColor="text1"/>
+          <w:sz w:val="19"/>
+          <w:szCs w:val="19"/>
+          <w:lang w:val="ru-US"/>
+        </w:rPr>
+      </w:pPr>
+      <w:r>
+        <w:rPr>
+          <w:rFonts w:ascii="JetBrains Mono" w:hAnsi="JetBrains Mono" w:cs="JetBrains Mono"/>
+          <w:b w:val="0"/>
+          <w:bCs w:val="0"/>
+          <w:color w:val="000000" w:themeColor="text1"/>
+          <w:sz w:val="19"/>
+          <w:szCs w:val="19"/>
+          <w:lang w:val="ru-US"/>
+        </w:rPr>
+        <w:t xml:space="preserve">        std::cin&gt;&gt;tr[i].x &gt;&gt; tr[i].y;</w:t>
+      </w:r>
+    </w:p>
+    <w:p>
+      <w:pPr>
+        <w:pStyle w:val="1"/>
+        <w:jc w:val="left"/>
+        <w:rPr>
+          <w:rFonts w:ascii="JetBrains Mono" w:hAnsi="JetBrains Mono" w:cs="JetBrains Mono"/>
+          <w:b w:val="0"/>
+          <w:bCs w:val="0"/>
+          <w:color w:val="000000" w:themeColor="text1"/>
+          <w:sz w:val="19"/>
+          <w:szCs w:val="19"/>
+          <w:lang w:val="ru-US"/>
+        </w:rPr>
+      </w:pPr>
+      <w:r>
+        <w:rPr>
+          <w:rFonts w:ascii="JetBrains Mono" w:hAnsi="JetBrains Mono" w:cs="JetBrains Mono"/>
+          <w:b w:val="0"/>
+          <w:bCs w:val="0"/>
+          <w:color w:val="000000" w:themeColor="text1"/>
+          <w:sz w:val="19"/>
+          <w:szCs w:val="19"/>
+          <w:lang w:val="ru-US"/>
+        </w:rPr>
+        <w:t xml:space="preserve">    }</w:t>
+      </w:r>
+    </w:p>
+    <w:p>
+      <w:pPr>
+        <w:pStyle w:val="1"/>
+        <w:jc w:val="left"/>
+        <w:rPr>
+          <w:rFonts w:ascii="JetBrains Mono" w:hAnsi="JetBrains Mono" w:cs="JetBrains Mono"/>
+          <w:b w:val="0"/>
+          <w:bCs w:val="0"/>
+          <w:color w:val="000000" w:themeColor="text1"/>
+          <w:sz w:val="19"/>
+          <w:szCs w:val="19"/>
+          <w:lang w:val="ru-US"/>
+        </w:rPr>
+      </w:pPr>
+      <w:r>
+        <w:rPr>
+          <w:rFonts w:ascii="JetBrains Mono" w:hAnsi="JetBrains Mono" w:cs="JetBrains Mono"/>
+          <w:b w:val="0"/>
+          <w:bCs w:val="0"/>
+          <w:color w:val="000000" w:themeColor="text1"/>
+          <w:sz w:val="19"/>
+          <w:szCs w:val="19"/>
+          <w:lang w:val="ru-US"/>
+        </w:rPr>
+        <w:t xml:space="preserve">    </w:t>
+      </w:r>
+    </w:p>
+    <w:p>
+      <w:pPr>
+        <w:pStyle w:val="1"/>
+        <w:jc w:val="left"/>
+        <w:rPr>
+          <w:rFonts w:ascii="JetBrains Mono" w:hAnsi="JetBrains Mono" w:cs="JetBrains Mono"/>
+          <w:b w:val="0"/>
+          <w:bCs w:val="0"/>
+          <w:color w:val="000000" w:themeColor="text1"/>
+          <w:sz w:val="19"/>
+          <w:szCs w:val="19"/>
+          <w:lang w:val="ru-US"/>
+        </w:rPr>
+      </w:pPr>
+      <w:r>
+        <w:rPr>
+          <w:rFonts w:ascii="JetBrains Mono" w:hAnsi="JetBrains Mono" w:cs="JetBrains Mono"/>
+          <w:b w:val="0"/>
+          <w:bCs w:val="0"/>
+          <w:color w:val="000000" w:themeColor="text1"/>
+          <w:sz w:val="19"/>
+          <w:szCs w:val="19"/>
+          <w:lang w:val="ru-US"/>
+        </w:rPr>
+        <w:t xml:space="preserve">    // Считываем точки для проверки, пока не встретим пару (0, 0) —</w:t>
+      </w:r>
+    </w:p>
+    <w:p>
+      <w:pPr>
+        <w:pStyle w:val="1"/>
+        <w:jc w:val="left"/>
+        <w:rPr>
+          <w:rFonts w:ascii="JetBrains Mono" w:hAnsi="JetBrains Mono" w:cs="JetBrains Mono"/>
+          <w:b w:val="0"/>
+          <w:bCs w:val="0"/>
+          <w:color w:val="000000" w:themeColor="text1"/>
+          <w:sz w:val="19"/>
+          <w:szCs w:val="19"/>
+          <w:lang w:val="ru-US"/>
+        </w:rPr>
+      </w:pPr>
+      <w:r>
+        <w:rPr>
+          <w:rFonts w:ascii="JetBrains Mono" w:hAnsi="JetBrains Mono" w:cs="JetBrains Mono"/>
+          <w:b w:val="0"/>
+          <w:bCs w:val="0"/>
+          <w:color w:val="000000" w:themeColor="text1"/>
+          <w:sz w:val="19"/>
+          <w:szCs w:val="19"/>
+          <w:lang w:val="ru-US"/>
+        </w:rPr>
+        <w:t xml:space="preserve">    // это признак конца ввода.</w:t>
+      </w:r>
+    </w:p>
+    <w:p>
+      <w:pPr>
+        <w:pStyle w:val="1"/>
+        <w:jc w:val="left"/>
+        <w:rPr>
+          <w:rFonts w:ascii="JetBrains Mono" w:hAnsi="JetBrains Mono" w:cs="JetBrains Mono"/>
+          <w:b w:val="0"/>
+          <w:bCs w:val="0"/>
+          <w:color w:val="000000" w:themeColor="text1"/>
+          <w:sz w:val="19"/>
+          <w:szCs w:val="19"/>
+          <w:lang w:val="ru-US"/>
+        </w:rPr>
+      </w:pPr>
+      <w:r>
+        <w:rPr>
+          <w:rFonts w:ascii="JetBrains Mono" w:hAnsi="JetBrains Mono" w:cs="JetBrains Mono"/>
+          <w:b w:val="0"/>
+          <w:bCs w:val="0"/>
+          <w:color w:val="000000" w:themeColor="text1"/>
+          <w:sz w:val="19"/>
+          <w:szCs w:val="19"/>
+          <w:lang w:val="ru-US"/>
+        </w:rPr>
+        <w:t xml:space="preserve">    for (;std::cin&gt;&gt;x&gt;&gt;y &amp;&amp; !(x == 0 &amp;&amp; y ==0);)</w:t>
+      </w:r>
+    </w:p>
+    <w:p>
+      <w:pPr>
+        <w:pStyle w:val="1"/>
+        <w:jc w:val="left"/>
+        <w:rPr>
+          <w:rFonts w:ascii="JetBrains Mono" w:hAnsi="JetBrains Mono" w:cs="JetBrains Mono"/>
+          <w:b w:val="0"/>
+          <w:bCs w:val="0"/>
+          <w:color w:val="000000" w:themeColor="text1"/>
+          <w:sz w:val="19"/>
+          <w:szCs w:val="19"/>
+          <w:lang w:val="ru-US"/>
+        </w:rPr>
+      </w:pPr>
+      <w:r>
+        <w:rPr>
+          <w:rFonts w:ascii="JetBrains Mono" w:hAnsi="JetBrains Mono" w:cs="JetBrains Mono"/>
+          <w:b w:val="0"/>
+          <w:bCs w:val="0"/>
+          <w:color w:val="000000" w:themeColor="text1"/>
+          <w:sz w:val="19"/>
+          <w:szCs w:val="19"/>
+          <w:lang w:val="ru-US"/>
+        </w:rPr>
+        <w:t xml:space="preserve">    {</w:t>
+      </w:r>
+    </w:p>
+    <w:p>
+      <w:pPr>
+        <w:pStyle w:val="1"/>
+        <w:jc w:val="left"/>
+        <w:rPr>
+          <w:rFonts w:ascii="JetBrains Mono" w:hAnsi="JetBrains Mono" w:cs="JetBrains Mono"/>
+          <w:b w:val="0"/>
+          <w:bCs w:val="0"/>
+          <w:color w:val="000000" w:themeColor="text1"/>
+          <w:sz w:val="19"/>
+          <w:szCs w:val="19"/>
+          <w:lang w:val="ru-US"/>
+        </w:rPr>
+      </w:pPr>
+      <w:r>
+        <w:rPr>
+          <w:rFonts w:ascii="JetBrains Mono" w:hAnsi="JetBrains Mono" w:cs="JetBrains Mono"/>
+          <w:b w:val="0"/>
+          <w:bCs w:val="0"/>
+          <w:color w:val="000000" w:themeColor="text1"/>
+          <w:sz w:val="19"/>
+          <w:szCs w:val="19"/>
+          <w:lang w:val="ru-US"/>
+        </w:rPr>
+        <w:t xml:space="preserve">        // Для каждой введённой точки выводим YES/NO —</w:t>
+      </w:r>
+    </w:p>
+    <w:p>
+      <w:pPr>
+        <w:pStyle w:val="1"/>
+        <w:jc w:val="left"/>
+        <w:rPr>
+          <w:rFonts w:ascii="JetBrains Mono" w:hAnsi="JetBrains Mono" w:cs="JetBrains Mono"/>
+          <w:b w:val="0"/>
+          <w:bCs w:val="0"/>
+          <w:color w:val="000000" w:themeColor="text1"/>
+          <w:sz w:val="19"/>
+          <w:szCs w:val="19"/>
+          <w:lang w:val="ru-US"/>
+        </w:rPr>
+      </w:pPr>
+      <w:r>
+        <w:rPr>
+          <w:rFonts w:ascii="JetBrains Mono" w:hAnsi="JetBrains Mono" w:cs="JetBrains Mono"/>
+          <w:b w:val="0"/>
+          <w:bCs w:val="0"/>
+          <w:color w:val="000000" w:themeColor="text1"/>
+          <w:sz w:val="19"/>
+          <w:szCs w:val="19"/>
+          <w:lang w:val="ru-US"/>
+        </w:rPr>
+        <w:t xml:space="preserve">        // находится ли она внутри треугольника tr.</w:t>
+      </w:r>
+    </w:p>
+    <w:p>
+      <w:pPr>
+        <w:pStyle w:val="1"/>
+        <w:jc w:val="left"/>
+        <w:rPr>
+          <w:rFonts w:ascii="JetBrains Mono" w:hAnsi="JetBrains Mono" w:cs="JetBrains Mono"/>
+          <w:b w:val="0"/>
+          <w:bCs w:val="0"/>
+          <w:color w:val="000000" w:themeColor="text1"/>
+          <w:sz w:val="19"/>
+          <w:szCs w:val="19"/>
+          <w:lang w:val="ru-US"/>
+        </w:rPr>
+      </w:pPr>
+      <w:r>
+        <w:rPr>
+          <w:rFonts w:ascii="JetBrains Mono" w:hAnsi="JetBrains Mono" w:cs="JetBrains Mono"/>
+          <w:b w:val="0"/>
+          <w:bCs w:val="0"/>
+          <w:color w:val="000000" w:themeColor="text1"/>
+          <w:sz w:val="19"/>
+          <w:szCs w:val="19"/>
+          <w:lang w:val="ru-US"/>
+        </w:rPr>
+        <w:t xml:space="preserve">        in_triangle(tr,Point(x,y));</w:t>
+      </w:r>
+    </w:p>
+    <w:p>
+      <w:pPr>
+        <w:pStyle w:val="1"/>
+        <w:jc w:val="left"/>
+        <w:rPr>
+          <w:rFonts w:ascii="JetBrains Mono" w:hAnsi="JetBrains Mono" w:cs="JetBrains Mono"/>
+          <w:b w:val="0"/>
+          <w:bCs w:val="0"/>
+          <w:color w:val="000000" w:themeColor="text1"/>
+          <w:sz w:val="19"/>
+          <w:szCs w:val="19"/>
+          <w:lang w:val="ru-US"/>
+        </w:rPr>
+      </w:pPr>
+      <w:r>
+        <w:rPr>
+          <w:rFonts w:ascii="JetBrains Mono" w:hAnsi="JetBrains Mono" w:cs="JetBrains Mono"/>
+          <w:b w:val="0"/>
+          <w:bCs w:val="0"/>
+          <w:color w:val="000000" w:themeColor="text1"/>
+          <w:sz w:val="19"/>
+          <w:szCs w:val="19"/>
+          <w:lang w:val="ru-US"/>
+        </w:rPr>
+        <w:t xml:space="preserve">    }</w:t>
+      </w:r>
+    </w:p>
+    <w:p>
+      <w:pPr>
+        <w:pStyle w:val="1"/>
+        <w:jc w:val="left"/>
       </w:pPr>
       <w:r>
         <w:rPr>
@@ -2212,12 +3468,6 @@
         </w:rPr>
         <w:t>}</w:t>
       </w:r>
-    </w:p>
-    <w:p>
-      <w:pPr>
-        <w:pStyle w:val="1"/>
-        <w:jc w:val="left"/>
-      </w:pPr>
       <w:r>
         <w:t>Описание тестов</w:t>
       </w:r>
@@ -2257,9 +3507,6 @@
       <w:pPr>
         <w:spacing w:after="120" w:line="276" w:lineRule="auto"/>
         <w:jc w:val="both"/>
-        <w:rPr>
-          <w:lang w:val="en-US"/>
-        </w:rPr>
       </w:pPr>
       <w:r>
         <w:t>5 1</w:t>
@@ -2326,9 +3573,377 @@
       <w:pPr>
         <w:spacing w:after="120" w:line="276" w:lineRule="auto"/>
         <w:jc w:val="both"/>
+      </w:pPr>
+      <w:r>
         <w:rPr>
           <w:lang w:val="en-US"/>
         </w:rPr>
+        <w:t>YES</w:t>
+      </w:r>
+    </w:p>
+    <w:p>
+      <w:pPr>
+        <w:spacing w:after="120" w:line="276" w:lineRule="auto"/>
+        <w:jc w:val="both"/>
+      </w:pPr>
+      <w:r>
+        <w:rPr>
+          <w:lang w:val="en-US"/>
+        </w:rPr>
+        <w:t>YES</w:t>
+      </w:r>
+    </w:p>
+    <w:p>
+      <w:pPr>
+        <w:spacing w:after="120" w:line="276" w:lineRule="auto"/>
+        <w:jc w:val="both"/>
+      </w:pPr>
+      <w:r>
+        <w:rPr>
+          <w:lang w:val="en-US"/>
+        </w:rPr>
+        <w:t>NO</w:t>
+      </w:r>
+    </w:p>
+    <w:p>
+      <w:pPr>
+        <w:spacing w:after="120" w:line="276" w:lineRule="auto"/>
+        <w:jc w:val="both"/>
+      </w:pPr>
+      <w:r>
+        <w:rPr>
+          <w:lang w:val="en-US"/>
+        </w:rPr>
+        <w:lastRenderedPageBreak/>
+        <w:t>NO</w:t>
+      </w:r>
+    </w:p>
+    <w:p>
+      <w:pPr>
+        <w:spacing w:after="120" w:line="276" w:lineRule="auto"/>
+        <w:jc w:val="both"/>
+      </w:pPr>
+      <w:r>
+        <w:t>Конец ввода</w:t>
+      </w:r>
+    </w:p>
+    <w:p>
+      <w:pPr>
+        <w:spacing w:after="120" w:line="276" w:lineRule="auto"/>
+        <w:jc w:val="both"/>
+      </w:pPr>
+      <w:r>
+        <w:rPr>
+          <w:b/>
+          <w:bCs/>
+        </w:rPr>
+        <w:t>Тест 2. Прямой угол выше гипотенузы (a = 1, b = 5)</w:t>
+      </w:r>
+    </w:p>
+    <w:p>
+      <w:pPr>
+        <w:spacing w:after="120" w:line="276" w:lineRule="auto"/>
+        <w:jc w:val="both"/>
+      </w:pPr>
+      <w:r>
+        <w:t>Вход:</w:t>
+      </w:r>
+    </w:p>
+    <w:p>
+      <w:pPr>
+        <w:spacing w:after="120" w:line="276" w:lineRule="auto"/>
+        <w:jc w:val="both"/>
+      </w:pPr>
+      <w:r>
+        <w:t>1 5</w:t>
+      </w:r>
+      <w:r>
+        <w:t xml:space="preserve"> </w:t>
+      </w:r>
+      <w:r>
+        <w:t>5 5</w:t>
+      </w:r>
+      <w:r>
+        <w:t xml:space="preserve"> 1 1</w:t>
+      </w:r>
+    </w:p>
+    <w:p>
+      <w:pPr>
+        <w:spacing w:after="120" w:line="276" w:lineRule="auto"/>
+        <w:jc w:val="both"/>
+      </w:pPr>
+      <w:r>
+        <w:t>2 3</w:t>
+      </w:r>
+    </w:p>
+    <w:p>
+      <w:pPr>
+        <w:spacing w:after="120" w:line="276" w:lineRule="auto"/>
+        <w:jc w:val="both"/>
+      </w:pPr>
+      <w:r>
+        <w:t>1 5</w:t>
+      </w:r>
+    </w:p>
+    <w:p>
+      <w:pPr>
+        <w:spacing w:after="120" w:line="276" w:lineRule="auto"/>
+        <w:jc w:val="both"/>
+      </w:pPr>
+      <w:r>
+        <w:t>0 4</w:t>
+      </w:r>
+    </w:p>
+    <w:p>
+      <w:pPr>
+        <w:spacing w:after="120" w:line="276" w:lineRule="auto"/>
+        <w:jc w:val="both"/>
+      </w:pPr>
+      <w:r>
+        <w:t>2 6</w:t>
+      </w:r>
+    </w:p>
+    <w:p>
+      <w:pPr>
+        <w:spacing w:after="120" w:line="276" w:lineRule="auto"/>
+        <w:jc w:val="both"/>
+      </w:pPr>
+      <w:r>
+        <w:t>0 0</w:t>
+      </w:r>
+    </w:p>
+    <w:p>
+      <w:pPr>
+        <w:spacing w:after="120" w:line="276" w:lineRule="auto"/>
+        <w:jc w:val="both"/>
+      </w:pPr>
+      <w:r>
+        <w:t>Ожидаемый выход:</w:t>
+      </w:r>
+    </w:p>
+    <w:p>
+      <w:pPr>
+        <w:spacing w:after="120" w:line="276" w:lineRule="auto"/>
+        <w:jc w:val="both"/>
+      </w:pPr>
+      <w:r>
+        <w:rPr>
+          <w:lang w:val="en-US"/>
+        </w:rPr>
+        <w:t>YES</w:t>
+      </w:r>
+    </w:p>
+    <w:p>
+      <w:pPr>
+        <w:spacing w:after="120" w:line="276" w:lineRule="auto"/>
+        <w:jc w:val="both"/>
+      </w:pPr>
+      <w:r>
+        <w:rPr>
+          <w:lang w:val="en-US"/>
+        </w:rPr>
+        <w:t>YES</w:t>
+      </w:r>
+      <w:r>
+        <w:br/>
+      </w:r>
+      <w:r>
+        <w:rPr>
+          <w:lang w:val="en-US"/>
+        </w:rPr>
+        <w:t>NO</w:t>
+      </w:r>
+    </w:p>
+    <w:p>
+      <w:pPr>
+        <w:spacing w:after="120" w:line="276" w:lineRule="auto"/>
+        <w:jc w:val="both"/>
+      </w:pPr>
+      <w:r>
+        <w:rPr>
+          <w:lang w:val="en-US"/>
+        </w:rPr>
+        <w:t>NO</w:t>
+      </w:r>
+    </w:p>
+    <w:p>
+      <w:pPr>
+        <w:spacing w:after="120" w:line="276" w:lineRule="auto"/>
+        <w:jc w:val="both"/>
+      </w:pPr>
+      <w:r>
+        <w:t>Конец</w:t>
+      </w:r>
+      <w:r>
+        <w:t xml:space="preserve"> </w:t>
+      </w:r>
+      <w:r>
+        <w:t>ввода</w:t>
+      </w:r>
+    </w:p>
+    <w:p>
+      <w:pPr>
+        <w:spacing w:after="120" w:line="276" w:lineRule="auto"/>
+        <w:jc w:val="both"/>
+      </w:pPr>
+      <w:r>
+        <w:rPr>
+          <w:b/>
+          <w:bCs/>
+        </w:rPr>
+        <w:t xml:space="preserve">Тест </w:t>
+      </w:r>
+      <w:r>
+        <w:rPr>
+          <w:b/>
+          <w:bCs/>
+        </w:rPr>
+        <w:t>3</w:t>
+      </w:r>
+      <w:r>
+        <w:rPr>
+          <w:b/>
+          <w:bCs/>
+        </w:rPr>
+        <w:t>. Точки на границах и в вершинах (a = 6, b = 2)</w:t>
+      </w:r>
+    </w:p>
+    <w:p>
+      <w:pPr>
+        <w:spacing w:after="120" w:line="276" w:lineRule="auto"/>
+        <w:jc w:val="both"/>
+      </w:pPr>
+      <w:r>
+        <w:t>Вход:</w:t>
+      </w:r>
+    </w:p>
+    <w:p>
+      <w:pPr>
+        <w:spacing w:after="120" w:line="276" w:lineRule="auto"/>
+        <w:jc w:val="both"/>
+      </w:pPr>
+      <w:r>
+        <w:t>6 2</w:t>
+      </w:r>
+      <w:r>
+        <w:t xml:space="preserve"> 6 6 2 2</w:t>
+      </w:r>
+    </w:p>
+    <w:p>
+      <w:pPr>
+        <w:spacing w:after="120" w:line="276" w:lineRule="auto"/>
+        <w:jc w:val="both"/>
+      </w:pPr>
+      <w:r>
+        <w:t>6 6</w:t>
+      </w:r>
+    </w:p>
+    <w:p>
+      <w:pPr>
+        <w:spacing w:after="120" w:line="276" w:lineRule="auto"/>
+        <w:jc w:val="both"/>
+      </w:pPr>
+      <w:r>
+        <w:t>2 2</w:t>
+      </w:r>
+    </w:p>
+    <w:p>
+      <w:pPr>
+        <w:spacing w:after="120" w:line="276" w:lineRule="auto"/>
+        <w:jc w:val="both"/>
+      </w:pPr>
+      <w:r>
+        <w:t>4 4</w:t>
+      </w:r>
+    </w:p>
+    <w:p>
+      <w:pPr>
+        <w:spacing w:after="120" w:line="276" w:lineRule="auto"/>
+        <w:jc w:val="both"/>
+      </w:pPr>
+      <w:r>
+        <w:t>5 3</w:t>
+      </w:r>
+    </w:p>
+    <w:p>
+      <w:pPr>
+        <w:spacing w:after="120" w:line="276" w:lineRule="auto"/>
+        <w:jc w:val="both"/>
+      </w:pPr>
+      <w:r>
+        <w:t>3 1</w:t>
+      </w:r>
+    </w:p>
+    <w:p>
+      <w:pPr>
+        <w:spacing w:after="120" w:line="276" w:lineRule="auto"/>
+        <w:jc w:val="both"/>
+      </w:pPr>
+      <w:r>
+        <w:t>0 0</w:t>
+      </w:r>
+    </w:p>
+    <w:p>
+      <w:pPr>
+        <w:spacing w:after="120" w:line="276" w:lineRule="auto"/>
+        <w:jc w:val="both"/>
+      </w:pPr>
+      <w:r>
+        <w:t>Ожидаемый выход:</w:t>
+      </w:r>
+    </w:p>
+    <w:p>
+      <w:pPr>
+        <w:spacing w:line="360" w:lineRule="auto"/>
+        <w:jc w:val="both"/>
+      </w:pPr>
+      <w:r>
+        <w:rPr>
+          <w:lang w:val="en-US"/>
+        </w:rPr>
+        <w:t>YES</w:t>
+      </w:r>
+    </w:p>
+    <w:p>
+      <w:pPr>
+        <w:spacing w:line="360" w:lineRule="auto"/>
+        <w:jc w:val="both"/>
+      </w:pPr>
+      <w:r>
+        <w:rPr>
+          <w:lang w:val="en-US"/>
+        </w:rPr>
+        <w:t>YES</w:t>
+      </w:r>
+    </w:p>
+    <w:p>
+      <w:pPr>
+        <w:spacing w:line="360" w:lineRule="auto"/>
+        <w:jc w:val="both"/>
+      </w:pPr>
+      <w:r>
+        <w:rPr>
+          <w:lang w:val="en-US"/>
+        </w:rPr>
+        <w:t>YES</w:t>
+      </w:r>
+    </w:p>
+    <w:p>
+      <w:pPr>
+        <w:spacing w:line="360" w:lineRule="auto"/>
+        <w:jc w:val="both"/>
+      </w:pPr>
+      <w:r>
+        <w:rPr>
+          <w:lang w:val="en-US"/>
+        </w:rPr>
+        <w:t>YES</w:t>
+      </w:r>
+    </w:p>
+    <w:p>
+      <w:pPr>
+        <w:spacing w:line="360" w:lineRule="auto"/>
+        <w:jc w:val="both"/>
       </w:pPr>
       <w:r>
         <w:rPr>
@@ -2340,455 +3955,25 @@
     </w:p>
     <w:p>
       <w:pPr>
-        <w:spacing w:after="120" w:line="276" w:lineRule="auto"/>
-        <w:jc w:val="both"/>
-        <w:rPr>
-          <w:lang w:val="en-US"/>
-        </w:rPr>
-      </w:pPr>
-      <w:r>
-        <w:rPr>
-          <w:lang w:val="en-US"/>
-        </w:rPr>
-        <w:t>YES</w:t>
-      </w:r>
-    </w:p>
-    <w:p>
-      <w:pPr>
-        <w:spacing w:after="120" w:line="276" w:lineRule="auto"/>
-        <w:jc w:val="both"/>
-        <w:rPr>
-          <w:lang w:val="en-US"/>
-        </w:rPr>
-      </w:pPr>
-      <w:r>
-        <w:rPr>
-          <w:lang w:val="en-US"/>
-        </w:rPr>
-        <w:t>NO</w:t>
-      </w:r>
-    </w:p>
-    <w:p>
-      <w:pPr>
-        <w:spacing w:after="120" w:line="276" w:lineRule="auto"/>
-        <w:jc w:val="both"/>
-        <w:rPr>
-          <w:lang w:val="en-US"/>
-        </w:rPr>
-      </w:pPr>
-      <w:r>
-        <w:rPr>
-          <w:lang w:val="en-US"/>
-        </w:rPr>
-        <w:t>NO</w:t>
-      </w:r>
-    </w:p>
-    <w:p>
-      <w:pPr>
-        <w:spacing w:after="120" w:line="276" w:lineRule="auto"/>
-        <w:jc w:val="both"/>
-      </w:pPr>
-      <w:r>
-        <w:t>Конец ввода</w:t>
-      </w:r>
-    </w:p>
-    <w:p>
-      <w:pPr>
-        <w:spacing w:after="120" w:line="276" w:lineRule="auto"/>
-        <w:jc w:val="both"/>
-      </w:pPr>
-      <w:r>
-        <w:rPr>
-          <w:b/>
-          <w:bCs/>
-        </w:rPr>
-        <w:t>Тест 2. Прямой угол выше гипотенузы (a = 1, b = 5)</w:t>
-      </w:r>
-    </w:p>
-    <w:p>
-      <w:pPr>
-        <w:spacing w:after="120" w:line="276" w:lineRule="auto"/>
-        <w:jc w:val="both"/>
-      </w:pPr>
-      <w:r>
-        <w:t>Вход:</w:t>
-      </w:r>
-    </w:p>
-    <w:p>
-      <w:pPr>
-        <w:spacing w:after="120" w:line="276" w:lineRule="auto"/>
-        <w:jc w:val="both"/>
-        <w:rPr>
-          <w:lang w:val="en-US"/>
-        </w:rPr>
-      </w:pPr>
-      <w:r>
-        <w:t>1 5</w:t>
-      </w:r>
-      <w:r>
-        <w:t xml:space="preserve"> </w:t>
-      </w:r>
-      <w:r>
-        <w:t>5 5</w:t>
-      </w:r>
-      <w:r>
-        <w:t xml:space="preserve"> 1 1</w:t>
-      </w:r>
-    </w:p>
-    <w:p>
-      <w:pPr>
-        <w:spacing w:after="120" w:line="276" w:lineRule="auto"/>
-        <w:jc w:val="both"/>
-      </w:pPr>
-      <w:r>
-        <w:t>2 3</w:t>
-      </w:r>
-    </w:p>
-    <w:p>
-      <w:pPr>
-        <w:spacing w:after="120" w:line="276" w:lineRule="auto"/>
-        <w:jc w:val="both"/>
-      </w:pPr>
-      <w:r>
-        <w:t>1 5</w:t>
-      </w:r>
-    </w:p>
-    <w:p>
-      <w:pPr>
-        <w:spacing w:after="120" w:line="276" w:lineRule="auto"/>
-        <w:jc w:val="both"/>
-      </w:pPr>
-      <w:r>
-        <w:t>0 4</w:t>
-      </w:r>
-    </w:p>
-    <w:p>
-      <w:pPr>
-        <w:spacing w:after="120" w:line="276" w:lineRule="auto"/>
-        <w:jc w:val="both"/>
-        <w:rPr>
-          <w:lang w:val="en-US"/>
-        </w:rPr>
-      </w:pPr>
-      <w:r>
-        <w:t>2 6</w:t>
-      </w:r>
-    </w:p>
-    <w:p>
-      <w:pPr>
-        <w:spacing w:after="120" w:line="276" w:lineRule="auto"/>
-        <w:jc w:val="both"/>
-      </w:pPr>
-      <w:r>
-        <w:t>0 0</w:t>
-      </w:r>
-    </w:p>
-    <w:p>
-      <w:pPr>
-        <w:spacing w:after="120" w:line="276" w:lineRule="auto"/>
-        <w:jc w:val="both"/>
-      </w:pPr>
-      <w:r>
-        <w:t>Ожидаемый выход:</w:t>
-      </w:r>
-    </w:p>
-    <w:p>
-      <w:pPr>
-        <w:spacing w:after="120" w:line="276" w:lineRule="auto"/>
-        <w:jc w:val="both"/>
-        <w:rPr>
-          <w:lang w:val="en-US"/>
-        </w:rPr>
-      </w:pPr>
-      <w:r>
-        <w:rPr>
-          <w:lang w:val="en-US"/>
-        </w:rPr>
-        <w:t>YES</w:t>
-      </w:r>
-    </w:p>
-    <w:p>
-      <w:pPr>
-        <w:spacing w:after="120" w:line="276" w:lineRule="auto"/>
-        <w:jc w:val="both"/>
-        <w:rPr>
-          <w:lang w:val="en-US"/>
-        </w:rPr>
-      </w:pPr>
-      <w:r>
-        <w:rPr>
-          <w:lang w:val="en-US"/>
-        </w:rPr>
-        <w:t>YES</w:t>
-      </w:r>
-      <w:r>
-        <w:rPr>
-          <w:lang w:val="en-US"/>
-        </w:rPr>
-        <w:br/>
-        <w:t>NO</w:t>
-      </w:r>
-    </w:p>
-    <w:p>
-      <w:pPr>
-        <w:spacing w:after="120" w:line="276" w:lineRule="auto"/>
-        <w:jc w:val="both"/>
-        <w:rPr>
-          <w:lang w:val="en-US"/>
-        </w:rPr>
-      </w:pPr>
-      <w:r>
-        <w:rPr>
-          <w:lang w:val="en-US"/>
-        </w:rPr>
-        <w:t>NO</w:t>
-      </w:r>
-    </w:p>
-    <w:p>
-      <w:pPr>
-        <w:spacing w:after="120" w:line="276" w:lineRule="auto"/>
-        <w:jc w:val="both"/>
-        <w:rPr>
-          <w:lang w:val="en-US"/>
-        </w:rPr>
-      </w:pPr>
-      <w:r>
-        <w:t>Конец</w:t>
-      </w:r>
-      <w:r>
-        <w:rPr>
-          <w:lang w:val="en-US"/>
-        </w:rPr>
-        <w:t xml:space="preserve"> </w:t>
-      </w:r>
-      <w:r>
-        <w:t>ввода</w:t>
-      </w:r>
-    </w:p>
-    <w:p>
-      <w:pPr>
-        <w:spacing w:after="120" w:line="276" w:lineRule="auto"/>
-        <w:jc w:val="both"/>
-      </w:pPr>
-      <w:r>
-        <w:rPr>
-          <w:b/>
-          <w:bCs/>
-        </w:rPr>
-        <w:t xml:space="preserve">Тест </w:t>
-      </w:r>
-      <w:r>
-        <w:rPr>
-          <w:b/>
-          <w:bCs/>
-          <w:lang w:val="en-US"/>
-        </w:rPr>
-        <w:t>3</w:t>
-      </w:r>
-      <w:r>
-        <w:rPr>
-          <w:b/>
-          <w:bCs/>
-        </w:rPr>
-        <w:t>. Точки на границах и в вершинах (a = 6, b = 2)</w:t>
-      </w:r>
-    </w:p>
-    <w:p>
-      <w:pPr>
-        <w:spacing w:after="120" w:line="276" w:lineRule="auto"/>
-        <w:jc w:val="both"/>
-      </w:pPr>
-      <w:r>
-        <w:t>Вход:</w:t>
-      </w:r>
-    </w:p>
-    <w:p>
-      <w:pPr>
-        <w:spacing w:after="120" w:line="276" w:lineRule="auto"/>
-        <w:jc w:val="both"/>
-        <w:rPr>
-          <w:lang w:val="en-US"/>
-        </w:rPr>
-      </w:pPr>
-      <w:r>
-        <w:t>6 2</w:t>
-      </w:r>
-      <w:r>
-        <w:t xml:space="preserve"> 6 6 2 2</w:t>
-      </w:r>
-    </w:p>
-    <w:p>
-      <w:pPr>
-        <w:spacing w:after="120" w:line="276" w:lineRule="auto"/>
-        <w:jc w:val="both"/>
-      </w:pPr>
-      <w:r>
-        <w:t>6 6</w:t>
-      </w:r>
-    </w:p>
-    <w:p>
-      <w:pPr>
-        <w:spacing w:after="120" w:line="276" w:lineRule="auto"/>
-        <w:jc w:val="both"/>
-      </w:pPr>
-      <w:r>
-        <w:t>2 2</w:t>
-      </w:r>
-    </w:p>
-    <w:p>
-      <w:pPr>
-        <w:spacing w:after="120" w:line="276" w:lineRule="auto"/>
-        <w:jc w:val="both"/>
-      </w:pPr>
-      <w:r>
-        <w:t>4 4</w:t>
-      </w:r>
-    </w:p>
-    <w:p>
-      <w:pPr>
-        <w:spacing w:after="120" w:line="276" w:lineRule="auto"/>
-        <w:jc w:val="both"/>
-      </w:pPr>
-      <w:r>
-        <w:t>5 3</w:t>
-      </w:r>
-    </w:p>
-    <w:p>
-      <w:pPr>
-        <w:spacing w:after="120" w:line="276" w:lineRule="auto"/>
-        <w:jc w:val="both"/>
-        <w:rPr>
-          <w:lang w:val="en-US"/>
-        </w:rPr>
-      </w:pPr>
-      <w:r>
-        <w:t>3 1</w:t>
-      </w:r>
-    </w:p>
-    <w:p>
-      <w:pPr>
-        <w:spacing w:after="120" w:line="276" w:lineRule="auto"/>
-        <w:jc w:val="both"/>
-      </w:pPr>
-      <w:r>
-        <w:t>0 0</w:t>
-      </w:r>
-    </w:p>
-    <w:p>
-      <w:pPr>
-        <w:spacing w:after="120" w:line="276" w:lineRule="auto"/>
-        <w:jc w:val="both"/>
-        <w:rPr>
-          <w:lang w:val="en-US"/>
-        </w:rPr>
-      </w:pPr>
-      <w:r>
-        <w:t>Ожидаемый выход:</w:t>
-      </w:r>
-    </w:p>
-    <w:p>
-      <w:pPr>
         <w:spacing w:line="360" w:lineRule="auto"/>
         <w:jc w:val="both"/>
+      </w:pPr>
+      <w:r>
         <w:rPr>
           <w:lang w:val="en-US"/>
         </w:rPr>
-      </w:pPr>
-      <w:r>
-        <w:rPr>
-          <w:lang w:val="en-US"/>
-        </w:rPr>
-        <w:t>YES</w:t>
+        <w:t>NO</w:t>
       </w:r>
     </w:p>
     <w:p>
       <w:pPr>
         <w:spacing w:line="360" w:lineRule="auto"/>
         <w:jc w:val="both"/>
-        <w:rPr>
-          <w:lang w:val="en-US"/>
-        </w:rPr>
-      </w:pPr>
-      <w:r>
-        <w:rPr>
-          <w:lang w:val="en-US"/>
-        </w:rPr>
-        <w:lastRenderedPageBreak/>
-        <w:t>YES</w:t>
-      </w:r>
-    </w:p>
-    <w:p>
-      <w:pPr>
-        <w:spacing w:line="360" w:lineRule="auto"/>
-        <w:jc w:val="both"/>
-        <w:rPr>
-          <w:lang w:val="en-US"/>
-        </w:rPr>
-      </w:pPr>
-      <w:r>
-        <w:rPr>
-          <w:lang w:val="en-US"/>
-        </w:rPr>
-        <w:t>YES</w:t>
-      </w:r>
-    </w:p>
-    <w:p>
-      <w:pPr>
-        <w:spacing w:line="360" w:lineRule="auto"/>
-        <w:jc w:val="both"/>
-        <w:rPr>
-          <w:lang w:val="en-US"/>
-        </w:rPr>
-      </w:pPr>
-      <w:r>
-        <w:rPr>
-          <w:lang w:val="en-US"/>
-        </w:rPr>
-        <w:t>YES</w:t>
-      </w:r>
-    </w:p>
-    <w:p>
-      <w:pPr>
-        <w:spacing w:line="360" w:lineRule="auto"/>
-        <w:jc w:val="both"/>
-        <w:rPr>
-          <w:lang w:val="en-US"/>
-        </w:rPr>
-      </w:pPr>
-      <w:r>
-        <w:rPr>
-          <w:lang w:val="en-US"/>
-        </w:rPr>
-        <w:t>YES</w:t>
-      </w:r>
-    </w:p>
-    <w:p>
-      <w:pPr>
-        <w:spacing w:line="360" w:lineRule="auto"/>
-        <w:jc w:val="both"/>
-      </w:pPr>
-      <w:r>
-        <w:rPr>
-          <w:lang w:val="en-US"/>
-        </w:rPr>
-        <w:t>NO</w:t>
-      </w:r>
-    </w:p>
-    <w:p>
-      <w:pPr>
-        <w:spacing w:line="360" w:lineRule="auto"/>
-        <w:jc w:val="both"/>
-        <w:rPr>
-          <w:lang w:val="en-US"/>
-        </w:rPr>
       </w:pPr>
       <w:r>
         <w:t>Конец</w:t>
       </w:r>
       <w:r>
-        <w:rPr>
-          <w:lang w:val="en-US"/>
-        </w:rPr>
         <w:t xml:space="preserve"> </w:t>
       </w:r>
       <w:r>
@@ -2800,9 +3985,6 @@
         <w:spacing w:line="360" w:lineRule="auto"/>
         <w:ind w:firstLine="709"/>
         <w:jc w:val="both"/>
-        <w:rPr>
-          <w:lang w:val="en-US"/>
-        </w:rPr>
       </w:pPr>
     </w:p>
     <w:p>
@@ -2810,9 +3992,6 @@
         <w:spacing w:line="360" w:lineRule="auto"/>
         <w:ind w:firstLine="709"/>
         <w:jc w:val="both"/>
-        <w:rPr>
-          <w:lang w:val="en-US"/>
-        </w:rPr>
       </w:pPr>
     </w:p>
     <w:p>
@@ -2820,9 +3999,6 @@
         <w:spacing w:line="360" w:lineRule="auto"/>
         <w:ind w:firstLine="709"/>
         <w:jc w:val="both"/>
-        <w:rPr>
-          <w:lang w:val="en-US"/>
-        </w:rPr>
       </w:pPr>
     </w:p>
     <w:p>
@@ -2830,9 +4006,6 @@
         <w:spacing w:line="360" w:lineRule="auto"/>
         <w:ind w:firstLine="709"/>
         <w:jc w:val="both"/>
-        <w:rPr>
-          <w:lang w:val="en-US"/>
-        </w:rPr>
       </w:pPr>
     </w:p>
     <w:p>
@@ -2840,9 +4013,6 @@
         <w:spacing w:line="360" w:lineRule="auto"/>
         <w:ind w:firstLine="709"/>
         <w:jc w:val="both"/>
-        <w:rPr>
-          <w:lang w:val="en-US"/>
-        </w:rPr>
       </w:pPr>
     </w:p>
     <w:p>
@@ -2850,9 +4020,6 @@
         <w:spacing w:line="360" w:lineRule="auto"/>
         <w:ind w:firstLine="709"/>
         <w:jc w:val="both"/>
-        <w:rPr>
-          <w:lang w:val="en-US"/>
-        </w:rPr>
       </w:pPr>
     </w:p>
     <w:p>
@@ -2861,9 +4028,6 @@
         <w:spacing w:before="0" w:after="0" w:line="360" w:lineRule="auto"/>
         <w:ind w:firstLine="709"/>
         <w:jc w:val="left"/>
-        <w:rPr>
-          <w:lang w:val="en-US"/>
-        </w:rPr>
       </w:pPr>
     </w:p>
     <w:p>
@@ -2872,9 +4036,6 @@
         <w:spacing w:before="0" w:after="0" w:line="360" w:lineRule="auto"/>
         <w:ind w:firstLine="709"/>
         <w:jc w:val="left"/>
-        <w:rPr>
-          <w:lang w:val="en-US"/>
-        </w:rPr>
       </w:pPr>
     </w:p>
     <w:p>
@@ -2904,6 +4065,9 @@
         <w:jc w:val="center"/>
       </w:pPr>
       <w:r>
+        <w:rPr>
+          <w:noProof/>
+        </w:rPr>
         <w:drawing>
           <wp:inline distT="0" distB="0" distL="0" distR="0" wp14:anchorId="7836C7AE" wp14:editId="68975EA3">
             <wp:extent cx="1346200" cy="2044700"/>
@@ -2963,7 +4127,9 @@
         <w:jc w:val="center"/>
       </w:pPr>
       <w:r>
-        <w:lastRenderedPageBreak/>
+        <w:rPr>
+          <w:noProof/>
+        </w:rPr>
         <w:drawing>
           <wp:inline distT="0" distB="0" distL="0" distR="0" wp14:anchorId="1471475E" wp14:editId="58CBAB1A">
             <wp:extent cx="1193800" cy="2032000"/>
@@ -3037,6 +4203,10 @@
         <w:jc w:val="center"/>
       </w:pPr>
       <w:r>
+        <w:rPr>
+          <w:noProof/>
+        </w:rPr>
+        <w:lastRenderedPageBreak/>
         <w:drawing>
           <wp:inline distT="0" distB="0" distL="0" distR="0" wp14:anchorId="13FF5285" wp14:editId="450D6F50">
             <wp:extent cx="1358900" cy="2425700"/>
@@ -3078,9 +4248,6 @@
       <w:pPr>
         <w:spacing w:after="120" w:line="276" w:lineRule="auto"/>
         <w:jc w:val="center"/>
-        <w:rPr>
-          <w:lang w:val="en-US"/>
-        </w:rPr>
       </w:pPr>
       <w:r>
         <w:rPr>
@@ -3093,7 +4260,6 @@
         <w:rPr>
           <w:b/>
           <w:bCs/>
-          <w:lang w:val="en-US"/>
         </w:rPr>
         <w:t>3</w:t>
       </w:r>
@@ -3108,9 +4274,6 @@
         <w:t xml:space="preserve"> Результаты выполнения теста </w:t>
       </w:r>
       <w:r>
-        <w:rPr>
-          <w:lang w:val="en-US"/>
-        </w:rPr>
         <w:t>3</w:t>
       </w:r>
     </w:p>
@@ -3165,7 +4328,6 @@
         <w:jc w:val="both"/>
       </w:pPr>
       <w:r>
-        <w:lastRenderedPageBreak/>
         <w:t>Полученные результаты показали, что программа корректно обрабатывает введённые координаты и правильно определяет принадлежность точек треугольнику. Также были закреплены навыки работы с функциями, условными конструкциями, вещественными числами и потоковым вводом-выводом в C++.</w:t>
       </w:r>
     </w:p>

</xml_diff>